<commit_message>
add big data stuff
</commit_message>
<xml_diff>
--- a/SEM2/Computer Vision/Practical/Journal/computer vision practical journal v1.docx
+++ b/SEM2/Computer Vision/Practical/Journal/computer vision practical journal v1.docx
@@ -1497,12 +1497,10 @@
         <w:t xml:space="preserve"> </w:t>
       </w:r>
       <w:proofErr w:type="spellStart"/>
-      <w:proofErr w:type="gramStart"/>
       <w:r>
         <w:t>matplotlib.transforms</w:t>
       </w:r>
       <w:proofErr w:type="spellEnd"/>
-      <w:proofErr w:type="gramEnd"/>
       <w:r>
         <w:rPr>
           <w:spacing w:val="-2"/>
@@ -1538,7 +1536,6 @@
         <w:t>points=</w:t>
       </w:r>
       <w:proofErr w:type="spellStart"/>
-      <w:proofErr w:type="gramStart"/>
       <w:r>
         <w:rPr>
           <w:spacing w:val="-2"/>
@@ -1546,40 +1543,11 @@
         <w:t>np.array</w:t>
       </w:r>
       <w:proofErr w:type="spellEnd"/>
-      <w:proofErr w:type="gramEnd"/>
-      <w:r>
-        <w:rPr>
-          <w:spacing w:val="-2"/>
-        </w:rPr>
-        <w:t>([[1,1</w:t>
-      </w:r>
-      <w:proofErr w:type="gramStart"/>
-      <w:r>
-        <w:rPr>
-          <w:spacing w:val="-2"/>
-        </w:rPr>
-        <w:t>],[</w:t>
-      </w:r>
-      <w:proofErr w:type="gramEnd"/>
-      <w:r>
-        <w:rPr>
-          <w:spacing w:val="-2"/>
-        </w:rPr>
-        <w:t>2,2</w:t>
-      </w:r>
-      <w:proofErr w:type="gramStart"/>
-      <w:r>
-        <w:rPr>
-          <w:spacing w:val="-2"/>
-        </w:rPr>
-        <w:t>],[</w:t>
-      </w:r>
-      <w:proofErr w:type="gramEnd"/>
-      <w:r>
-        <w:rPr>
-          <w:spacing w:val="-2"/>
-        </w:rPr>
-        <w:t>3,1]])</w:t>
+      <w:r>
+        <w:rPr>
+          <w:spacing w:val="-2"/>
+        </w:rPr>
+        <w:t>([[1,1],[2,2],[3,1]])</w:t>
       </w:r>
     </w:p>
     <w:p>
@@ -1603,7 +1571,6 @@
         <w:t>=</w:t>
       </w:r>
       <w:proofErr w:type="spellStart"/>
-      <w:proofErr w:type="gramStart"/>
       <w:r>
         <w:rPr>
           <w:spacing w:val="-2"/>
@@ -1611,40 +1578,11 @@
         <w:t>np.array</w:t>
       </w:r>
       <w:proofErr w:type="spellEnd"/>
-      <w:proofErr w:type="gramEnd"/>
-      <w:r>
-        <w:rPr>
-          <w:spacing w:val="-2"/>
-        </w:rPr>
-        <w:t>([[1,0,2</w:t>
-      </w:r>
-      <w:proofErr w:type="gramStart"/>
-      <w:r>
-        <w:rPr>
-          <w:spacing w:val="-2"/>
-        </w:rPr>
-        <w:t>],[</w:t>
-      </w:r>
-      <w:proofErr w:type="gramEnd"/>
-      <w:r>
-        <w:rPr>
-          <w:spacing w:val="-2"/>
-        </w:rPr>
-        <w:t>0,1,3</w:t>
-      </w:r>
-      <w:proofErr w:type="gramStart"/>
-      <w:r>
-        <w:rPr>
-          <w:spacing w:val="-2"/>
-        </w:rPr>
-        <w:t>],[</w:t>
-      </w:r>
-      <w:proofErr w:type="gramEnd"/>
-      <w:r>
-        <w:rPr>
-          <w:spacing w:val="-2"/>
-        </w:rPr>
-        <w:t xml:space="preserve">0,0,1]]) </w:t>
+      <w:r>
+        <w:rPr>
+          <w:spacing w:val="-2"/>
+        </w:rPr>
+        <w:t xml:space="preserve">([[1,0,2],[0,1,3],[0,0,1]]) </w:t>
       </w:r>
       <w:proofErr w:type="spellStart"/>
       <w:r>
@@ -1658,60 +1596,23 @@
         <w:rPr>
           <w:spacing w:val="-2"/>
         </w:rPr>
-        <w:t>=</w:t>
-      </w:r>
-      <w:proofErr w:type="gramStart"/>
-      <w:r>
-        <w:rPr>
-          <w:spacing w:val="-2"/>
-        </w:rPr>
-        <w:t>np.dot(</w:t>
-      </w:r>
-      <w:proofErr w:type="spellStart"/>
-      <w:proofErr w:type="gramEnd"/>
-      <w:r>
-        <w:rPr>
-          <w:spacing w:val="-2"/>
-        </w:rPr>
-        <w:t>translation_</w:t>
-      </w:r>
-      <w:proofErr w:type="gramStart"/>
-      <w:r>
-        <w:rPr>
-          <w:spacing w:val="-2"/>
-        </w:rPr>
-        <w:t>matrix,np</w:t>
-      </w:r>
-      <w:proofErr w:type="gramEnd"/>
-      <w:r>
-        <w:rPr>
-          <w:spacing w:val="-2"/>
-        </w:rPr>
-        <w:t>.</w:t>
-      </w:r>
-      <w:proofErr w:type="gramStart"/>
-      <w:r>
-        <w:rPr>
-          <w:spacing w:val="-2"/>
-        </w:rPr>
-        <w:t>hstack</w:t>
-      </w:r>
-      <w:proofErr w:type="spellEnd"/>
-      <w:r>
-        <w:rPr>
-          <w:spacing w:val="-2"/>
-        </w:rPr>
-        <w:t>(</w:t>
-      </w:r>
-      <w:proofErr w:type="gramEnd"/>
-      <w:r>
-        <w:rPr>
-          <w:spacing w:val="-2"/>
-        </w:rPr>
-        <w:t xml:space="preserve">[points, </w:t>
-      </w:r>
-      <w:proofErr w:type="spellStart"/>
-      <w:proofErr w:type="gramStart"/>
+        <w:t>=np.dot(</w:t>
+      </w:r>
+      <w:proofErr w:type="spellStart"/>
+      <w:r>
+        <w:rPr>
+          <w:spacing w:val="-2"/>
+        </w:rPr>
+        <w:t>translation_matrix,np.hstack</w:t>
+      </w:r>
+      <w:proofErr w:type="spellEnd"/>
+      <w:r>
+        <w:rPr>
+          <w:spacing w:val="-2"/>
+        </w:rPr>
+        <w:t xml:space="preserve">([points, </w:t>
+      </w:r>
+      <w:proofErr w:type="spellStart"/>
       <w:r>
         <w:rPr>
           <w:spacing w:val="-2"/>
@@ -1719,7 +1620,6 @@
         <w:t>np.ones</w:t>
       </w:r>
       <w:proofErr w:type="spellEnd"/>
-      <w:proofErr w:type="gramEnd"/>
       <w:r>
         <w:rPr>
           <w:spacing w:val="-2"/>
@@ -1727,7 +1627,6 @@
         <w:t>((</w:t>
       </w:r>
       <w:proofErr w:type="spellStart"/>
-      <w:proofErr w:type="gramStart"/>
       <w:r>
         <w:rPr>
           <w:spacing w:val="-2"/>
@@ -1735,26 +1634,11 @@
         <w:t>points.shape</w:t>
       </w:r>
       <w:proofErr w:type="spellEnd"/>
-      <w:proofErr w:type="gramEnd"/>
-      <w:r>
-        <w:rPr>
-          <w:spacing w:val="-2"/>
-        </w:rPr>
-        <w:t>[0],1))]</w:t>
-      </w:r>
-      <w:proofErr w:type="gramStart"/>
-      <w:r>
-        <w:rPr>
-          <w:spacing w:val="-2"/>
-        </w:rPr>
-        <w:t>).T).T[:,:</w:t>
-      </w:r>
-      <w:proofErr w:type="gramEnd"/>
-      <w:r>
-        <w:rPr>
-          <w:spacing w:val="-2"/>
-        </w:rPr>
-        <w:t>2]</w:t>
+      <w:r>
+        <w:rPr>
+          <w:spacing w:val="-2"/>
+        </w:rPr>
+        <w:t>[0],1))]).T).T[:,:2]</w:t>
       </w:r>
     </w:p>
     <w:p>
@@ -1824,7 +1708,6 @@
         <w:t>=</w:t>
       </w:r>
       <w:proofErr w:type="spellStart"/>
-      <w:proofErr w:type="gramStart"/>
       <w:r>
         <w:rPr>
           <w:spacing w:val="-2"/>
@@ -1832,7 +1715,6 @@
         <w:t>np.array</w:t>
       </w:r>
       <w:proofErr w:type="spellEnd"/>
-      <w:proofErr w:type="gramEnd"/>
       <w:r>
         <w:rPr>
           <w:spacing w:val="-2"/>
@@ -1851,21 +1733,7 @@
         <w:rPr>
           <w:spacing w:val="-2"/>
         </w:rPr>
-        <w:t>(theta</w:t>
-      </w:r>
-      <w:proofErr w:type="gramStart"/>
-      <w:r>
-        <w:rPr>
-          <w:spacing w:val="-2"/>
-        </w:rPr>
-        <w:t>),-</w:t>
-      </w:r>
-      <w:proofErr w:type="gramEnd"/>
-      <w:r>
-        <w:rPr>
-          <w:spacing w:val="-2"/>
-        </w:rPr>
-        <w:t xml:space="preserve"> </w:t>
+        <w:t xml:space="preserve">(theta),- </w:t>
       </w:r>
       <w:proofErr w:type="spellStart"/>
       <w:r>
@@ -1879,17 +1747,9 @@
         <w:rPr>
           <w:spacing w:val="-2"/>
         </w:rPr>
-        <w:t>(theta),0</w:t>
-      </w:r>
-      <w:proofErr w:type="gramStart"/>
-      <w:r>
-        <w:rPr>
-          <w:spacing w:val="-2"/>
-        </w:rPr>
-        <w:t>],[</w:t>
-      </w:r>
-      <w:proofErr w:type="spellStart"/>
-      <w:proofErr w:type="gramEnd"/>
+        <w:t>(theta),0],[</w:t>
+      </w:r>
+      <w:proofErr w:type="spellStart"/>
       <w:r>
         <w:rPr>
           <w:spacing w:val="-2"/>
@@ -1901,14 +1761,7 @@
         <w:rPr>
           <w:spacing w:val="-2"/>
         </w:rPr>
-        <w:t>(theta</w:t>
-      </w:r>
-      <w:proofErr w:type="gramStart"/>
-      <w:r>
-        <w:rPr>
-          <w:spacing w:val="-2"/>
-        </w:rPr>
-        <w:t>),</w:t>
+        <w:t>(theta),</w:t>
       </w:r>
       <w:proofErr w:type="spellStart"/>
       <w:r>
@@ -1918,26 +1771,11 @@
         <w:t>np.cos</w:t>
       </w:r>
       <w:proofErr w:type="spellEnd"/>
-      <w:proofErr w:type="gramEnd"/>
-      <w:r>
-        <w:rPr>
-          <w:spacing w:val="-2"/>
-        </w:rPr>
-        <w:t>(theta),0</w:t>
-      </w:r>
-      <w:proofErr w:type="gramStart"/>
-      <w:r>
-        <w:rPr>
-          <w:spacing w:val="-2"/>
-        </w:rPr>
-        <w:t>],[</w:t>
-      </w:r>
-      <w:proofErr w:type="gramEnd"/>
-      <w:r>
-        <w:rPr>
-          <w:spacing w:val="-2"/>
-        </w:rPr>
-        <w:t xml:space="preserve">0,0,1]]) </w:t>
+      <w:r>
+        <w:rPr>
+          <w:spacing w:val="-2"/>
+        </w:rPr>
+        <w:t xml:space="preserve">(theta),0],[0,0,1]]) </w:t>
       </w:r>
       <w:proofErr w:type="spellStart"/>
       <w:r>
@@ -1951,60 +1789,23 @@
         <w:rPr>
           <w:spacing w:val="-2"/>
         </w:rPr>
-        <w:t>=</w:t>
-      </w:r>
-      <w:proofErr w:type="gramStart"/>
-      <w:r>
-        <w:rPr>
-          <w:spacing w:val="-2"/>
-        </w:rPr>
-        <w:t>np.dot(</w:t>
-      </w:r>
-      <w:proofErr w:type="spellStart"/>
-      <w:proofErr w:type="gramEnd"/>
-      <w:r>
-        <w:rPr>
-          <w:spacing w:val="-2"/>
-        </w:rPr>
-        <w:t>rotation_</w:t>
-      </w:r>
-      <w:proofErr w:type="gramStart"/>
-      <w:r>
-        <w:rPr>
-          <w:spacing w:val="-2"/>
-        </w:rPr>
-        <w:t>matrix,np</w:t>
-      </w:r>
-      <w:proofErr w:type="gramEnd"/>
-      <w:r>
-        <w:rPr>
-          <w:spacing w:val="-2"/>
-        </w:rPr>
-        <w:t>.</w:t>
-      </w:r>
-      <w:proofErr w:type="gramStart"/>
-      <w:r>
-        <w:rPr>
-          <w:spacing w:val="-2"/>
-        </w:rPr>
-        <w:t>hstack</w:t>
-      </w:r>
-      <w:proofErr w:type="spellEnd"/>
-      <w:r>
-        <w:rPr>
-          <w:spacing w:val="-2"/>
-        </w:rPr>
-        <w:t>(</w:t>
-      </w:r>
-      <w:proofErr w:type="gramEnd"/>
-      <w:r>
-        <w:rPr>
-          <w:spacing w:val="-2"/>
-        </w:rPr>
-        <w:t xml:space="preserve">[points, </w:t>
-      </w:r>
-      <w:proofErr w:type="spellStart"/>
-      <w:proofErr w:type="gramStart"/>
+        <w:t>=np.dot(</w:t>
+      </w:r>
+      <w:proofErr w:type="spellStart"/>
+      <w:r>
+        <w:rPr>
+          <w:spacing w:val="-2"/>
+        </w:rPr>
+        <w:t>rotation_matrix,np.hstack</w:t>
+      </w:r>
+      <w:proofErr w:type="spellEnd"/>
+      <w:r>
+        <w:rPr>
+          <w:spacing w:val="-2"/>
+        </w:rPr>
+        <w:t xml:space="preserve">([points, </w:t>
+      </w:r>
+      <w:proofErr w:type="spellStart"/>
       <w:r>
         <w:rPr>
           <w:spacing w:val="-2"/>
@@ -2012,7 +1813,6 @@
         <w:t>np.ones</w:t>
       </w:r>
       <w:proofErr w:type="spellEnd"/>
-      <w:proofErr w:type="gramEnd"/>
       <w:r>
         <w:rPr>
           <w:spacing w:val="-2"/>
@@ -2020,7 +1820,6 @@
         <w:t>((</w:t>
       </w:r>
       <w:proofErr w:type="spellStart"/>
-      <w:proofErr w:type="gramStart"/>
       <w:r>
         <w:rPr>
           <w:spacing w:val="-2"/>
@@ -2028,26 +1827,11 @@
         <w:t>points.shape</w:t>
       </w:r>
       <w:proofErr w:type="spellEnd"/>
-      <w:proofErr w:type="gramEnd"/>
-      <w:r>
-        <w:rPr>
-          <w:spacing w:val="-2"/>
-        </w:rPr>
-        <w:t>[0],1))]</w:t>
-      </w:r>
-      <w:proofErr w:type="gramStart"/>
-      <w:r>
-        <w:rPr>
-          <w:spacing w:val="-2"/>
-        </w:rPr>
-        <w:t>).T).T[:,:</w:t>
-      </w:r>
-      <w:proofErr w:type="gramEnd"/>
-      <w:r>
-        <w:rPr>
-          <w:spacing w:val="-2"/>
-        </w:rPr>
-        <w:t>2]</w:t>
+      <w:r>
+        <w:rPr>
+          <w:spacing w:val="-2"/>
+        </w:rPr>
+        <w:t>[0],1))]).T).T[:,:2]</w:t>
       </w:r>
     </w:p>
     <w:p>
@@ -2071,7 +1855,6 @@
         <w:t>=</w:t>
       </w:r>
       <w:proofErr w:type="spellStart"/>
-      <w:proofErr w:type="gramStart"/>
       <w:r>
         <w:rPr>
           <w:spacing w:val="-2"/>
@@ -2079,96 +1862,11 @@
         <w:t>np.array</w:t>
       </w:r>
       <w:proofErr w:type="spellEnd"/>
-      <w:proofErr w:type="gramEnd"/>
-      <w:r>
-        <w:rPr>
-          <w:spacing w:val="-2"/>
-        </w:rPr>
-        <w:t>([[2,0,0</w:t>
-      </w:r>
-      <w:proofErr w:type="gramStart"/>
-      <w:r>
-        <w:rPr>
-          <w:spacing w:val="-2"/>
-        </w:rPr>
-        <w:t>],[</w:t>
-      </w:r>
-      <w:proofErr w:type="gramEnd"/>
-      <w:r>
-        <w:rPr>
-          <w:spacing w:val="-2"/>
-        </w:rPr>
-        <w:t>0,2,0</w:t>
-      </w:r>
-      <w:proofErr w:type="gramStart"/>
-      <w:r>
-        <w:rPr>
-          <w:spacing w:val="-2"/>
-        </w:rPr>
-        <w:t>],[</w:t>
-      </w:r>
-      <w:proofErr w:type="gramEnd"/>
-      <w:r>
-        <w:rPr>
-          <w:spacing w:val="-2"/>
-        </w:rPr>
-        <w:t>0,0,1]]) scaled_points=np.dot(scaling_</w:t>
-      </w:r>
-      <w:proofErr w:type="gramStart"/>
-      <w:r>
-        <w:rPr>
-          <w:spacing w:val="-2"/>
-        </w:rPr>
-        <w:t>matrix,np</w:t>
-      </w:r>
-      <w:proofErr w:type="gramEnd"/>
-      <w:r>
-        <w:rPr>
-          <w:spacing w:val="-2"/>
-        </w:rPr>
-        <w:t>.hstack([</w:t>
-      </w:r>
-      <w:proofErr w:type="gramStart"/>
-      <w:r>
-        <w:rPr>
-          <w:spacing w:val="-2"/>
-        </w:rPr>
-        <w:t>points,np</w:t>
-      </w:r>
-      <w:proofErr w:type="gramEnd"/>
-      <w:r>
-        <w:rPr>
-          <w:spacing w:val="-2"/>
-        </w:rPr>
-        <w:t>.ones((</w:t>
-      </w:r>
-      <w:proofErr w:type="gramStart"/>
-      <w:r>
-        <w:rPr>
-          <w:spacing w:val="-2"/>
-        </w:rPr>
-        <w:t>points.shape</w:t>
-      </w:r>
-      <w:proofErr w:type="gramEnd"/>
-      <w:r>
-        <w:rPr>
-          <w:spacing w:val="-2"/>
-        </w:rPr>
-        <w:t>[0], 1))]</w:t>
-      </w:r>
-      <w:proofErr w:type="gramStart"/>
-      <w:r>
-        <w:rPr>
-          <w:spacing w:val="-2"/>
-        </w:rPr>
-        <w:t>).T).T[:,:</w:t>
-      </w:r>
-      <w:proofErr w:type="gramEnd"/>
-      <w:r>
-        <w:rPr>
-          <w:spacing w:val="-2"/>
-        </w:rPr>
-        <w:t>2]</w:t>
+      <w:r>
+        <w:rPr>
+          <w:spacing w:val="-2"/>
+        </w:rPr>
+        <w:t>([[2,0,0],[0,2,0],[0,0,1]]) scaled_points=np.dot(scaling_matrix,np.hstack([points,np.ones((points.shape[0], 1))]).T).T[:,:2]</w:t>
       </w:r>
     </w:p>
     <w:p>
@@ -2178,7 +1876,6 @@
         <w:ind w:left="23" w:right="7106"/>
       </w:pPr>
       <w:proofErr w:type="spellStart"/>
-      <w:proofErr w:type="gramStart"/>
       <w:r>
         <w:rPr>
           <w:spacing w:val="-2"/>
@@ -2186,7 +1883,6 @@
         <w:t>plt.figure</w:t>
       </w:r>
       <w:proofErr w:type="spellEnd"/>
-      <w:proofErr w:type="gramEnd"/>
       <w:r>
         <w:rPr>
           <w:spacing w:val="-2"/>
@@ -2201,22 +1897,13 @@
         <w:t>figsize</w:t>
       </w:r>
       <w:proofErr w:type="spellEnd"/>
-      <w:proofErr w:type="gramStart"/>
-      <w:r>
-        <w:rPr>
-          <w:spacing w:val="-2"/>
-        </w:rPr>
-        <w:t>=(</w:t>
-      </w:r>
-      <w:proofErr w:type="gramEnd"/>
-      <w:r>
-        <w:rPr>
-          <w:spacing w:val="-2"/>
-        </w:rPr>
-        <w:t xml:space="preserve">10,5)) </w:t>
-      </w:r>
-      <w:proofErr w:type="spellStart"/>
-      <w:proofErr w:type="gramStart"/>
+      <w:r>
+        <w:rPr>
+          <w:spacing w:val="-2"/>
+        </w:rPr>
+        <w:t xml:space="preserve">=(10,5)) </w:t>
+      </w:r>
+      <w:proofErr w:type="spellStart"/>
       <w:r>
         <w:rPr>
           <w:spacing w:val="-2"/>
@@ -2224,7 +1911,6 @@
         <w:t>plt.subplot</w:t>
       </w:r>
       <w:proofErr w:type="spellEnd"/>
-      <w:proofErr w:type="gramEnd"/>
       <w:r>
         <w:rPr>
           <w:spacing w:val="-2"/>
@@ -2232,7 +1918,6 @@
         <w:t xml:space="preserve">(1,3,1) </w:t>
       </w:r>
       <w:proofErr w:type="spellStart"/>
-      <w:proofErr w:type="gramStart"/>
       <w:r>
         <w:rPr>
           <w:spacing w:val="-2"/>
@@ -2240,7 +1925,6 @@
         <w:t>plt.title</w:t>
       </w:r>
       <w:proofErr w:type="spellEnd"/>
-      <w:proofErr w:type="gramEnd"/>
       <w:r>
         <w:rPr>
           <w:spacing w:val="-2"/>
@@ -2255,7 +1939,6 @@
         <w:ind w:left="23" w:right="1702"/>
       </w:pPr>
       <w:proofErr w:type="spellStart"/>
-      <w:proofErr w:type="gramStart"/>
       <w:r>
         <w:rPr>
           <w:spacing w:val="-2"/>
@@ -2263,40 +1946,11 @@
         <w:t>plt.plot</w:t>
       </w:r>
       <w:proofErr w:type="spellEnd"/>
-      <w:proofErr w:type="gramEnd"/>
-      <w:r>
-        <w:rPr>
-          <w:spacing w:val="-2"/>
-        </w:rPr>
-        <w:t>(points</w:t>
-      </w:r>
-      <w:proofErr w:type="gramStart"/>
-      <w:r>
-        <w:rPr>
-          <w:spacing w:val="-2"/>
-        </w:rPr>
-        <w:t>[:,</w:t>
-      </w:r>
-      <w:proofErr w:type="gramEnd"/>
-      <w:r>
-        <w:rPr>
-          <w:spacing w:val="-2"/>
-        </w:rPr>
-        <w:t>0</w:t>
-      </w:r>
-      <w:proofErr w:type="gramStart"/>
-      <w:r>
-        <w:rPr>
-          <w:spacing w:val="-2"/>
-        </w:rPr>
-        <w:t>],points[:,</w:t>
-      </w:r>
-      <w:proofErr w:type="gramEnd"/>
-      <w:r>
-        <w:rPr>
-          <w:spacing w:val="-2"/>
-        </w:rPr>
-        <w:t>1],'</w:t>
+      <w:r>
+        <w:rPr>
+          <w:spacing w:val="-2"/>
+        </w:rPr>
+        <w:t>(points[:,0],points[:,1],'</w:t>
       </w:r>
       <w:proofErr w:type="spellStart"/>
       <w:r>
@@ -2306,92 +1960,13 @@
         <w:t>bo</w:t>
       </w:r>
       <w:proofErr w:type="spellEnd"/>
-      <w:proofErr w:type="gramStart"/>
-      <w:r>
-        <w:rPr>
-          <w:spacing w:val="-2"/>
-        </w:rPr>
-        <w:t>',label</w:t>
-      </w:r>
-      <w:proofErr w:type="gramEnd"/>
-      <w:r>
-        <w:rPr>
-          <w:spacing w:val="-2"/>
-        </w:rPr>
-        <w:t xml:space="preserve">='original') </w:t>
-      </w:r>
-      <w:proofErr w:type="gramStart"/>
-      <w:r>
-        <w:rPr>
-          <w:spacing w:val="-2"/>
-        </w:rPr>
-        <w:t>plt.plot</w:t>
-      </w:r>
-      <w:proofErr w:type="gramEnd"/>
-      <w:r>
-        <w:rPr>
-          <w:spacing w:val="-2"/>
-        </w:rPr>
-        <w:t>(translated_points</w:t>
-      </w:r>
-      <w:proofErr w:type="gramStart"/>
-      <w:r>
-        <w:rPr>
-          <w:spacing w:val="-2"/>
-        </w:rPr>
-        <w:t>[:,</w:t>
-      </w:r>
-      <w:proofErr w:type="gramEnd"/>
-      <w:r>
-        <w:rPr>
-          <w:spacing w:val="-2"/>
-        </w:rPr>
-        <w:t>0</w:t>
-      </w:r>
-      <w:proofErr w:type="gramStart"/>
-      <w:r>
-        <w:rPr>
-          <w:spacing w:val="-2"/>
-        </w:rPr>
-        <w:t>],translated</w:t>
-      </w:r>
-      <w:proofErr w:type="gramEnd"/>
-      <w:r>
-        <w:rPr>
-          <w:spacing w:val="-2"/>
-        </w:rPr>
-        <w:t>_points</w:t>
-      </w:r>
-      <w:proofErr w:type="gramStart"/>
-      <w:r>
-        <w:rPr>
-          <w:spacing w:val="-2"/>
-        </w:rPr>
-        <w:t>[:,</w:t>
-      </w:r>
-      <w:proofErr w:type="gramEnd"/>
-      <w:r>
-        <w:rPr>
-          <w:spacing w:val="-2"/>
-        </w:rPr>
-        <w:t>1],'r+</w:t>
-      </w:r>
-      <w:proofErr w:type="gramStart"/>
-      <w:r>
-        <w:rPr>
-          <w:spacing w:val="-2"/>
-        </w:rPr>
-        <w:t>',label</w:t>
-      </w:r>
-      <w:proofErr w:type="gramEnd"/>
-      <w:r>
-        <w:rPr>
-          <w:spacing w:val="-2"/>
-        </w:rPr>
-        <w:t xml:space="preserve">='Translated') </w:t>
-      </w:r>
-      <w:proofErr w:type="spellStart"/>
-      <w:proofErr w:type="gramStart"/>
+      <w:r>
+        <w:rPr>
+          <w:spacing w:val="-2"/>
+        </w:rPr>
+        <w:t xml:space="preserve">',label='original') plt.plot(translated_points[:,0],translated_points[:,1],'r+',label='Translated') </w:t>
+      </w:r>
+      <w:proofErr w:type="spellStart"/>
       <w:r>
         <w:rPr>
           <w:spacing w:val="-2"/>
@@ -2399,7 +1974,6 @@
         <w:t>plt.axis</w:t>
       </w:r>
       <w:proofErr w:type="spellEnd"/>
-      <w:proofErr w:type="gramEnd"/>
       <w:r>
         <w:rPr>
           <w:spacing w:val="-2"/>
@@ -2414,7 +1988,6 @@
         <w:ind w:left="23" w:right="7106"/>
       </w:pPr>
       <w:proofErr w:type="spellStart"/>
-      <w:proofErr w:type="gramStart"/>
       <w:r>
         <w:rPr>
           <w:spacing w:val="-2"/>
@@ -2422,7 +1995,6 @@
         <w:t>plt.legend</w:t>
       </w:r>
       <w:proofErr w:type="spellEnd"/>
-      <w:proofErr w:type="gramEnd"/>
       <w:r>
         <w:rPr>
           <w:spacing w:val="-2"/>
@@ -2430,7 +2002,6 @@
         <w:t xml:space="preserve">() </w:t>
       </w:r>
       <w:proofErr w:type="spellStart"/>
-      <w:proofErr w:type="gramStart"/>
       <w:r>
         <w:rPr>
           <w:spacing w:val="-2"/>
@@ -2438,7 +2009,6 @@
         <w:t>plt.subplot</w:t>
       </w:r>
       <w:proofErr w:type="spellEnd"/>
-      <w:proofErr w:type="gramEnd"/>
       <w:r>
         <w:rPr>
           <w:spacing w:val="-2"/>
@@ -2446,7 +2016,6 @@
         <w:t xml:space="preserve">(1,3,2) </w:t>
       </w:r>
       <w:proofErr w:type="spellStart"/>
-      <w:proofErr w:type="gramStart"/>
       <w:r>
         <w:rPr>
           <w:spacing w:val="-2"/>
@@ -2454,7 +2023,6 @@
         <w:t>plt.title</w:t>
       </w:r>
       <w:proofErr w:type="spellEnd"/>
-      <w:proofErr w:type="gramEnd"/>
       <w:r>
         <w:rPr>
           <w:spacing w:val="-2"/>
@@ -2469,7 +2037,6 @@
         <w:ind w:left="23" w:right="2844"/>
       </w:pPr>
       <w:proofErr w:type="spellStart"/>
-      <w:proofErr w:type="gramStart"/>
       <w:r>
         <w:rPr>
           <w:spacing w:val="-2"/>
@@ -2477,40 +2044,11 @@
         <w:t>plt.plot</w:t>
       </w:r>
       <w:proofErr w:type="spellEnd"/>
-      <w:proofErr w:type="gramEnd"/>
-      <w:r>
-        <w:rPr>
-          <w:spacing w:val="-2"/>
-        </w:rPr>
-        <w:t>(points</w:t>
-      </w:r>
-      <w:proofErr w:type="gramStart"/>
-      <w:r>
-        <w:rPr>
-          <w:spacing w:val="-2"/>
-        </w:rPr>
-        <w:t>[:,</w:t>
-      </w:r>
-      <w:proofErr w:type="gramEnd"/>
-      <w:r>
-        <w:rPr>
-          <w:spacing w:val="-2"/>
-        </w:rPr>
-        <w:t>0</w:t>
-      </w:r>
-      <w:proofErr w:type="gramStart"/>
-      <w:r>
-        <w:rPr>
-          <w:spacing w:val="-2"/>
-        </w:rPr>
-        <w:t>],points[:,</w:t>
-      </w:r>
-      <w:proofErr w:type="gramEnd"/>
-      <w:r>
-        <w:rPr>
-          <w:spacing w:val="-2"/>
-        </w:rPr>
-        <w:t>1],'</w:t>
+      <w:r>
+        <w:rPr>
+          <w:spacing w:val="-2"/>
+        </w:rPr>
+        <w:t>(points[:,0],points[:,1],'</w:t>
       </w:r>
       <w:proofErr w:type="spellStart"/>
       <w:r>
@@ -2520,92 +2058,13 @@
         <w:t>bo</w:t>
       </w:r>
       <w:proofErr w:type="spellEnd"/>
-      <w:proofErr w:type="gramStart"/>
-      <w:r>
-        <w:rPr>
-          <w:spacing w:val="-2"/>
-        </w:rPr>
-        <w:t>',label</w:t>
-      </w:r>
-      <w:proofErr w:type="gramEnd"/>
-      <w:r>
-        <w:rPr>
-          <w:spacing w:val="-2"/>
-        </w:rPr>
-        <w:t xml:space="preserve">='original') </w:t>
-      </w:r>
-      <w:proofErr w:type="gramStart"/>
-      <w:r>
-        <w:rPr>
-          <w:spacing w:val="-2"/>
-        </w:rPr>
-        <w:t>plt.plot</w:t>
-      </w:r>
-      <w:proofErr w:type="gramEnd"/>
-      <w:r>
-        <w:rPr>
-          <w:spacing w:val="-2"/>
-        </w:rPr>
-        <w:t>(rotated_points</w:t>
-      </w:r>
-      <w:proofErr w:type="gramStart"/>
-      <w:r>
-        <w:rPr>
-          <w:spacing w:val="-2"/>
-        </w:rPr>
-        <w:t>[:,</w:t>
-      </w:r>
-      <w:proofErr w:type="gramEnd"/>
-      <w:r>
-        <w:rPr>
-          <w:spacing w:val="-2"/>
-        </w:rPr>
-        <w:t>0</w:t>
-      </w:r>
-      <w:proofErr w:type="gramStart"/>
-      <w:r>
-        <w:rPr>
-          <w:spacing w:val="-2"/>
-        </w:rPr>
-        <w:t>],rotated</w:t>
-      </w:r>
-      <w:proofErr w:type="gramEnd"/>
-      <w:r>
-        <w:rPr>
-          <w:spacing w:val="-2"/>
-        </w:rPr>
-        <w:t>_points</w:t>
-      </w:r>
-      <w:proofErr w:type="gramStart"/>
-      <w:r>
-        <w:rPr>
-          <w:spacing w:val="-2"/>
-        </w:rPr>
-        <w:t>[:,</w:t>
-      </w:r>
-      <w:proofErr w:type="gramEnd"/>
-      <w:r>
-        <w:rPr>
-          <w:spacing w:val="-2"/>
-        </w:rPr>
-        <w:t>1],'r+</w:t>
-      </w:r>
-      <w:proofErr w:type="gramStart"/>
-      <w:r>
-        <w:rPr>
-          <w:spacing w:val="-2"/>
-        </w:rPr>
-        <w:t>',label</w:t>
-      </w:r>
-      <w:proofErr w:type="gramEnd"/>
-      <w:r>
-        <w:rPr>
-          <w:spacing w:val="-2"/>
-        </w:rPr>
-        <w:t xml:space="preserve">='Rotated') </w:t>
-      </w:r>
-      <w:proofErr w:type="spellStart"/>
-      <w:proofErr w:type="gramStart"/>
+      <w:r>
+        <w:rPr>
+          <w:spacing w:val="-2"/>
+        </w:rPr>
+        <w:t xml:space="preserve">',label='original') plt.plot(rotated_points[:,0],rotated_points[:,1],'r+',label='Rotated') </w:t>
+      </w:r>
+      <w:proofErr w:type="spellStart"/>
       <w:r>
         <w:rPr>
           <w:spacing w:val="-2"/>
@@ -2613,7 +2072,6 @@
         <w:t>plt.axis</w:t>
       </w:r>
       <w:proofErr w:type="spellEnd"/>
-      <w:proofErr w:type="gramEnd"/>
       <w:r>
         <w:rPr>
           <w:spacing w:val="-2"/>
@@ -2628,7 +2086,6 @@
         <w:ind w:left="23" w:right="7106"/>
       </w:pPr>
       <w:proofErr w:type="spellStart"/>
-      <w:proofErr w:type="gramStart"/>
       <w:r>
         <w:rPr>
           <w:spacing w:val="-2"/>
@@ -2636,7 +2093,6 @@
         <w:t>plt.legend</w:t>
       </w:r>
       <w:proofErr w:type="spellEnd"/>
-      <w:proofErr w:type="gramEnd"/>
       <w:r>
         <w:rPr>
           <w:spacing w:val="-2"/>
@@ -2644,7 +2100,6 @@
         <w:t xml:space="preserve">() </w:t>
       </w:r>
       <w:proofErr w:type="spellStart"/>
-      <w:proofErr w:type="gramStart"/>
       <w:r>
         <w:rPr>
           <w:spacing w:val="-2"/>
@@ -2652,7 +2107,6 @@
         <w:t>plt.subplot</w:t>
       </w:r>
       <w:proofErr w:type="spellEnd"/>
-      <w:proofErr w:type="gramEnd"/>
       <w:r>
         <w:rPr>
           <w:spacing w:val="-2"/>
@@ -2660,7 +2114,6 @@
         <w:t xml:space="preserve">(1,3,3) </w:t>
       </w:r>
       <w:proofErr w:type="spellStart"/>
-      <w:proofErr w:type="gramStart"/>
       <w:r>
         <w:rPr>
           <w:spacing w:val="-2"/>
@@ -2668,7 +2121,6 @@
         <w:t>plt.title</w:t>
       </w:r>
       <w:proofErr w:type="spellEnd"/>
-      <w:proofErr w:type="gramEnd"/>
       <w:r>
         <w:rPr>
           <w:spacing w:val="-2"/>
@@ -2683,7 +2135,6 @@
         <w:ind w:left="23" w:right="2844"/>
       </w:pPr>
       <w:proofErr w:type="spellStart"/>
-      <w:proofErr w:type="gramStart"/>
       <w:r>
         <w:rPr>
           <w:spacing w:val="-2"/>
@@ -2691,40 +2142,11 @@
         <w:t>plt.plot</w:t>
       </w:r>
       <w:proofErr w:type="spellEnd"/>
-      <w:proofErr w:type="gramEnd"/>
-      <w:r>
-        <w:rPr>
-          <w:spacing w:val="-2"/>
-        </w:rPr>
-        <w:t>(points</w:t>
-      </w:r>
-      <w:proofErr w:type="gramStart"/>
-      <w:r>
-        <w:rPr>
-          <w:spacing w:val="-2"/>
-        </w:rPr>
-        <w:t>[:,</w:t>
-      </w:r>
-      <w:proofErr w:type="gramEnd"/>
-      <w:r>
-        <w:rPr>
-          <w:spacing w:val="-2"/>
-        </w:rPr>
-        <w:t>0</w:t>
-      </w:r>
-      <w:proofErr w:type="gramStart"/>
-      <w:r>
-        <w:rPr>
-          <w:spacing w:val="-2"/>
-        </w:rPr>
-        <w:t>],points[:,</w:t>
-      </w:r>
-      <w:proofErr w:type="gramEnd"/>
-      <w:r>
-        <w:rPr>
-          <w:spacing w:val="-2"/>
-        </w:rPr>
-        <w:t>1],'</w:t>
+      <w:r>
+        <w:rPr>
+          <w:spacing w:val="-2"/>
+        </w:rPr>
+        <w:t>(points[:,0],points[:,1],'</w:t>
       </w:r>
       <w:proofErr w:type="spellStart"/>
       <w:r>
@@ -2734,92 +2156,13 @@
         <w:t>bo</w:t>
       </w:r>
       <w:proofErr w:type="spellEnd"/>
-      <w:proofErr w:type="gramStart"/>
-      <w:r>
-        <w:rPr>
-          <w:spacing w:val="-2"/>
-        </w:rPr>
-        <w:t>',label</w:t>
-      </w:r>
-      <w:proofErr w:type="gramEnd"/>
-      <w:r>
-        <w:rPr>
-          <w:spacing w:val="-2"/>
-        </w:rPr>
-        <w:t xml:space="preserve">='original') </w:t>
-      </w:r>
-      <w:proofErr w:type="gramStart"/>
-      <w:r>
-        <w:rPr>
-          <w:spacing w:val="-2"/>
-        </w:rPr>
-        <w:t>plt.plot</w:t>
-      </w:r>
-      <w:proofErr w:type="gramEnd"/>
-      <w:r>
-        <w:rPr>
-          <w:spacing w:val="-2"/>
-        </w:rPr>
-        <w:t>(scaled_points</w:t>
-      </w:r>
-      <w:proofErr w:type="gramStart"/>
-      <w:r>
-        <w:rPr>
-          <w:spacing w:val="-2"/>
-        </w:rPr>
-        <w:t>[:,</w:t>
-      </w:r>
-      <w:proofErr w:type="gramEnd"/>
-      <w:r>
-        <w:rPr>
-          <w:spacing w:val="-2"/>
-        </w:rPr>
-        <w:t>0</w:t>
-      </w:r>
-      <w:proofErr w:type="gramStart"/>
-      <w:r>
-        <w:rPr>
-          <w:spacing w:val="-2"/>
-        </w:rPr>
-        <w:t>],scaled</w:t>
-      </w:r>
-      <w:proofErr w:type="gramEnd"/>
-      <w:r>
-        <w:rPr>
-          <w:spacing w:val="-2"/>
-        </w:rPr>
-        <w:t>_points</w:t>
-      </w:r>
-      <w:proofErr w:type="gramStart"/>
-      <w:r>
-        <w:rPr>
-          <w:spacing w:val="-2"/>
-        </w:rPr>
-        <w:t>[:,</w:t>
-      </w:r>
-      <w:proofErr w:type="gramEnd"/>
-      <w:r>
-        <w:rPr>
-          <w:spacing w:val="-2"/>
-        </w:rPr>
-        <w:t>1],'r+</w:t>
-      </w:r>
-      <w:proofErr w:type="gramStart"/>
-      <w:r>
-        <w:rPr>
-          <w:spacing w:val="-2"/>
-        </w:rPr>
-        <w:t>',label</w:t>
-      </w:r>
-      <w:proofErr w:type="gramEnd"/>
-      <w:r>
-        <w:rPr>
-          <w:spacing w:val="-2"/>
-        </w:rPr>
-        <w:t xml:space="preserve">='Scaled') </w:t>
-      </w:r>
-      <w:proofErr w:type="spellStart"/>
-      <w:proofErr w:type="gramStart"/>
+      <w:r>
+        <w:rPr>
+          <w:spacing w:val="-2"/>
+        </w:rPr>
+        <w:t xml:space="preserve">',label='original') plt.plot(scaled_points[:,0],scaled_points[:,1],'r+',label='Scaled') </w:t>
+      </w:r>
+      <w:proofErr w:type="spellStart"/>
       <w:r>
         <w:rPr>
           <w:spacing w:val="-2"/>
@@ -2827,7 +2170,6 @@
         <w:t>plt.axis</w:t>
       </w:r>
       <w:proofErr w:type="spellEnd"/>
-      <w:proofErr w:type="gramEnd"/>
       <w:r>
         <w:rPr>
           <w:spacing w:val="-2"/>
@@ -2845,7 +2187,6 @@
         </w:rPr>
       </w:pPr>
       <w:proofErr w:type="spellStart"/>
-      <w:proofErr w:type="gramStart"/>
       <w:r>
         <w:rPr>
           <w:spacing w:val="-2"/>
@@ -2853,7 +2194,6 @@
         <w:t>plt.legend</w:t>
       </w:r>
       <w:proofErr w:type="spellEnd"/>
-      <w:proofErr w:type="gramEnd"/>
       <w:r>
         <w:rPr>
           <w:spacing w:val="-2"/>
@@ -2861,7 +2201,6 @@
         <w:t xml:space="preserve">() </w:t>
       </w:r>
       <w:proofErr w:type="spellStart"/>
-      <w:proofErr w:type="gramStart"/>
       <w:r>
         <w:rPr>
           <w:spacing w:val="-2"/>
@@ -2869,7 +2208,6 @@
         <w:t>plt.show</w:t>
       </w:r>
       <w:proofErr w:type="spellEnd"/>
-      <w:proofErr w:type="gramEnd"/>
       <w:r>
         <w:rPr>
           <w:spacing w:val="-2"/>
@@ -3415,23 +2753,7 @@
         <w:t>img</w:t>
       </w:r>
       <w:r>
-        <w:t xml:space="preserve">.jpg") </w:t>
-      </w:r>
-      <w:proofErr w:type="gramStart"/>
-      <w:r>
-        <w:t>print(</w:t>
-      </w:r>
-      <w:proofErr w:type="gramEnd"/>
-      <w:r>
-        <w:t xml:space="preserve">"Image 1 shape:", image1.shape) </w:t>
-      </w:r>
-      <w:proofErr w:type="gramStart"/>
-      <w:r>
-        <w:t>print(</w:t>
-      </w:r>
-      <w:proofErr w:type="gramEnd"/>
-      <w:r>
-        <w:t>"Image 2 shape:", image2.shape)</w:t>
+        <w:t>.jpg") print("Image 1 shape:", image1.shape) print("Image 2 shape:", image2.shape)</w:t>
       </w:r>
     </w:p>
     <w:p>
@@ -3525,21 +2847,7 @@
         <w:rPr>
           <w:spacing w:val="-2"/>
         </w:rPr>
-        <w:t>cv2.SIFT_</w:t>
-      </w:r>
-      <w:proofErr w:type="gramStart"/>
-      <w:r>
-        <w:rPr>
-          <w:spacing w:val="-2"/>
-        </w:rPr>
-        <w:t>create(</w:t>
-      </w:r>
-      <w:proofErr w:type="gramEnd"/>
-      <w:r>
-        <w:rPr>
-          <w:spacing w:val="-2"/>
-        </w:rPr>
-        <w:t>)</w:t>
+        <w:t>cv2.SIFT_create()</w:t>
       </w:r>
     </w:p>
     <w:p>
@@ -3576,12 +2884,10 @@
         <w:t xml:space="preserve"> </w:t>
       </w:r>
       <w:proofErr w:type="spellStart"/>
-      <w:proofErr w:type="gramStart"/>
       <w:r>
         <w:t>sift.detectAndCompute</w:t>
       </w:r>
       <w:proofErr w:type="spellEnd"/>
-      <w:proofErr w:type="gramEnd"/>
       <w:r>
         <w:t>(gray1,</w:t>
       </w:r>
@@ -3619,12 +2925,10 @@
         <w:t xml:space="preserve"> </w:t>
       </w:r>
       <w:proofErr w:type="spellStart"/>
-      <w:proofErr w:type="gramStart"/>
       <w:r>
         <w:t>sift.detectAndCompute</w:t>
       </w:r>
       <w:proofErr w:type="spellEnd"/>
-      <w:proofErr w:type="gramEnd"/>
       <w:r>
         <w:t>(gray2,</w:t>
       </w:r>
@@ -3687,12 +2991,10 @@
         <w:t xml:space="preserve">matches = </w:t>
       </w:r>
       <w:proofErr w:type="spellStart"/>
-      <w:proofErr w:type="gramStart"/>
       <w:r>
         <w:t>matcher.match</w:t>
       </w:r>
       <w:proofErr w:type="spellEnd"/>
-      <w:proofErr w:type="gramEnd"/>
       <w:r>
         <w:t>(descriptors1, descriptors2) matches</w:t>
       </w:r>
@@ -3711,13 +3013,8 @@
         </w:rPr>
         <w:t xml:space="preserve"> </w:t>
       </w:r>
-      <w:proofErr w:type="gramStart"/>
-      <w:r>
-        <w:t>sorted(</w:t>
-      </w:r>
-      <w:proofErr w:type="gramEnd"/>
-      <w:r>
-        <w:t>matches,</w:t>
+      <w:r>
+        <w:t>sorted(matches,</w:t>
       </w:r>
       <w:r>
         <w:rPr>
@@ -3744,12 +3041,10 @@
         <w:t xml:space="preserve"> </w:t>
       </w:r>
       <w:proofErr w:type="spellStart"/>
-      <w:proofErr w:type="gramStart"/>
       <w:r>
         <w:t>x.distance</w:t>
       </w:r>
       <w:proofErr w:type="spellEnd"/>
-      <w:proofErr w:type="gramEnd"/>
       <w:r>
         <w:t>)</w:t>
       </w:r>
@@ -3778,21 +3073,14 @@
         </w:rPr>
         <w:t xml:space="preserve"> </w:t>
       </w:r>
-      <w:proofErr w:type="gramStart"/>
-      <w:r>
-        <w:t>np.float</w:t>
-      </w:r>
-      <w:proofErr w:type="gramEnd"/>
-      <w:r>
-        <w:t>32([keypoints1[</w:t>
-      </w:r>
-      <w:proofErr w:type="spellStart"/>
-      <w:proofErr w:type="gramStart"/>
+      <w:r>
+        <w:t>np.float32([keypoints1[</w:t>
+      </w:r>
+      <w:proofErr w:type="spellStart"/>
       <w:r>
         <w:t>match.queryIdx</w:t>
       </w:r>
       <w:proofErr w:type="spellEnd"/>
-      <w:proofErr w:type="gramEnd"/>
       <w:r>
         <w:t>].pt</w:t>
       </w:r>
@@ -3830,15 +3118,7 @@
         <w:t xml:space="preserve"> </w:t>
       </w:r>
       <w:r>
-        <w:t>matches]</w:t>
-      </w:r>
-      <w:proofErr w:type="gramStart"/>
-      <w:r>
-        <w:t>).reshape</w:t>
-      </w:r>
-      <w:proofErr w:type="gramEnd"/>
-      <w:r>
-        <w:t>(-1,</w:t>
+        <w:t>matches]).reshape(-1,</w:t>
       </w:r>
       <w:r>
         <w:rPr>
@@ -3856,15 +3136,7 @@
         <w:t xml:space="preserve"> </w:t>
       </w:r>
       <w:r>
-        <w:t xml:space="preserve">2) </w:t>
-      </w:r>
-      <w:proofErr w:type="gramStart"/>
-      <w:r>
-        <w:t>print(</w:t>
-      </w:r>
-      <w:proofErr w:type="gramEnd"/>
-      <w:r>
-        <w:t xml:space="preserve">"Number of points in points1:", </w:t>
+        <w:t xml:space="preserve">2) print("Number of points in points1:", </w:t>
       </w:r>
       <w:proofErr w:type="spellStart"/>
       <w:r>
@@ -3905,21 +3177,14 @@
         </w:rPr>
         <w:t xml:space="preserve"> </w:t>
       </w:r>
-      <w:proofErr w:type="gramStart"/>
-      <w:r>
-        <w:t>np.float</w:t>
-      </w:r>
-      <w:proofErr w:type="gramEnd"/>
-      <w:r>
-        <w:t>32([keypoints2[</w:t>
-      </w:r>
-      <w:proofErr w:type="spellStart"/>
-      <w:proofErr w:type="gramStart"/>
+      <w:r>
+        <w:t>np.float32([keypoints2[</w:t>
+      </w:r>
+      <w:proofErr w:type="spellStart"/>
       <w:r>
         <w:t>match.trainIdx</w:t>
       </w:r>
       <w:proofErr w:type="spellEnd"/>
-      <w:proofErr w:type="gramEnd"/>
       <w:r>
         <w:t>].pt</w:t>
       </w:r>
@@ -3957,15 +3222,7 @@
         <w:t xml:space="preserve"> </w:t>
       </w:r>
       <w:r>
-        <w:t>matches]</w:t>
-      </w:r>
-      <w:proofErr w:type="gramStart"/>
-      <w:r>
-        <w:t>).reshape</w:t>
-      </w:r>
-      <w:proofErr w:type="gramEnd"/>
-      <w:r>
-        <w:t>(-1,</w:t>
+        <w:t>matches]).reshape(-1,</w:t>
       </w:r>
       <w:r>
         <w:rPr>
@@ -3983,15 +3240,7 @@
         <w:t xml:space="preserve"> </w:t>
       </w:r>
       <w:r>
-        <w:t xml:space="preserve">2) </w:t>
-      </w:r>
-      <w:proofErr w:type="gramStart"/>
-      <w:r>
-        <w:t>print(</w:t>
-      </w:r>
-      <w:proofErr w:type="gramEnd"/>
-      <w:r>
-        <w:t xml:space="preserve">"Number of points in points2:", </w:t>
+        <w:t xml:space="preserve">2) print("Number of points in points2:", </w:t>
       </w:r>
       <w:proofErr w:type="spellStart"/>
       <w:r>
@@ -4170,27 +3419,11 @@
       </w:r>
       <w:proofErr w:type="spellStart"/>
       <w:r>
-        <w:t>stitched_</w:t>
-      </w:r>
-      <w:proofErr w:type="gramStart"/>
-      <w:r>
-        <w:t>image</w:t>
-      </w:r>
-      <w:proofErr w:type="spellEnd"/>
-      <w:r>
-        <w:t>[0:image2.shape</w:t>
-      </w:r>
-      <w:proofErr w:type="gramEnd"/>
-      <w:r>
-        <w:t xml:space="preserve">[0], </w:t>
-      </w:r>
-      <w:proofErr w:type="gramStart"/>
-      <w:r>
-        <w:t>0:image2.shape</w:t>
-      </w:r>
-      <w:proofErr w:type="gramEnd"/>
-      <w:r>
-        <w:t>[1]] = image2</w:t>
+        <w:t>stitched_image</w:t>
+      </w:r>
+      <w:proofErr w:type="spellEnd"/>
+      <w:r>
+        <w:t>[0:image2.shape[0], 0:image2.shape[1]] = image2</w:t>
       </w:r>
     </w:p>
     <w:p>
@@ -7260,12 +6493,10 @@
         <w:t xml:space="preserve"> </w:t>
       </w:r>
       <w:proofErr w:type="spellStart"/>
-      <w:proofErr w:type="gramStart"/>
       <w:r>
         <w:t>np.zeros</w:t>
       </w:r>
       <w:proofErr w:type="spellEnd"/>
-      <w:proofErr w:type="gramEnd"/>
       <w:r>
         <w:t>((</w:t>
       </w:r>
@@ -7306,19 +6537,11 @@
       <w:r>
         <w:t xml:space="preserve">3), </w:t>
       </w:r>
-      <w:proofErr w:type="gramStart"/>
-      <w:r>
-        <w:rPr>
-          <w:spacing w:val="-2"/>
-        </w:rPr>
-        <w:t>np.float</w:t>
-      </w:r>
-      <w:proofErr w:type="gramEnd"/>
-      <w:r>
-        <w:rPr>
-          <w:spacing w:val="-2"/>
-        </w:rPr>
-        <w:t>32)</w:t>
+      <w:r>
+        <w:rPr>
+          <w:spacing w:val="-2"/>
+        </w:rPr>
+        <w:t>np.float32)</w:t>
       </w:r>
     </w:p>
     <w:p>
@@ -7332,11 +6555,9 @@
         <w:t>objp</w:t>
       </w:r>
       <w:proofErr w:type="spellEnd"/>
-      <w:proofErr w:type="gramStart"/>
       <w:r>
         <w:t>[:,</w:t>
       </w:r>
-      <w:proofErr w:type="gramEnd"/>
       <w:r>
         <w:rPr>
           <w:spacing w:val="-7"/>
@@ -7362,12 +6583,10 @@
         <w:t xml:space="preserve"> </w:t>
       </w:r>
       <w:proofErr w:type="spellStart"/>
-      <w:proofErr w:type="gramStart"/>
       <w:r>
         <w:t>np.mgrid</w:t>
       </w:r>
       <w:proofErr w:type="spellEnd"/>
-      <w:proofErr w:type="gramEnd"/>
       <w:r>
         <w:t>[0:num_corners_x,</w:t>
       </w:r>
@@ -7381,12 +6600,10 @@
         <w:t>0:num_corners_y].</w:t>
       </w:r>
       <w:proofErr w:type="spellStart"/>
-      <w:proofErr w:type="gramStart"/>
       <w:r>
         <w:t>T.reshape</w:t>
       </w:r>
       <w:proofErr w:type="spellEnd"/>
-      <w:proofErr w:type="gramEnd"/>
       <w:r>
         <w:t>(-1,</w:t>
       </w:r>
@@ -7484,12 +6701,10 @@
         <w:t xml:space="preserve">images = </w:t>
       </w:r>
       <w:proofErr w:type="spellStart"/>
-      <w:proofErr w:type="gramStart"/>
       <w:r>
         <w:t>glob.glob</w:t>
       </w:r>
       <w:proofErr w:type="spellEnd"/>
-      <w:proofErr w:type="gramEnd"/>
       <w:r>
         <w:t>("C:\</w:t>
       </w:r>
@@ -7699,12 +6914,10 @@
         <w:spacing w:before="183" w:line="398" w:lineRule="auto"/>
         <w:ind w:left="503" w:right="4720"/>
       </w:pPr>
-      <w:proofErr w:type="gramStart"/>
       <w:r>
         <w:t>print(</w:t>
       </w:r>
       <w:proofErr w:type="spellStart"/>
-      <w:proofErr w:type="gramEnd"/>
       <w:r>
         <w:t>f"Could</w:t>
       </w:r>
@@ -7892,17 +7105,12 @@
         <w:t xml:space="preserve"> </w:t>
       </w:r>
       <w:proofErr w:type="spellStart"/>
-      <w:proofErr w:type="gramStart"/>
       <w:r>
         <w:t>gray.shape</w:t>
       </w:r>
       <w:proofErr w:type="spellEnd"/>
       <w:r>
-        <w:t>[::</w:t>
-      </w:r>
-      <w:proofErr w:type="gramEnd"/>
-      <w:r>
-        <w:t>-1]</w:t>
+        <w:t>[::-1]</w:t>
       </w:r>
     </w:p>
     <w:p>
@@ -8066,7 +7274,6 @@
         <w:ind w:left="503"/>
       </w:pPr>
       <w:proofErr w:type="spellStart"/>
-      <w:proofErr w:type="gramStart"/>
       <w:r>
         <w:rPr>
           <w:spacing w:val="-2"/>
@@ -8074,7 +7281,6 @@
         <w:t>objpoints.append</w:t>
       </w:r>
       <w:proofErr w:type="spellEnd"/>
-      <w:proofErr w:type="gramEnd"/>
       <w:r>
         <w:rPr>
           <w:spacing w:val="-2"/>
@@ -8114,15 +7320,7 @@
         <w:ind w:left="743" w:right="5815" w:hanging="240"/>
       </w:pPr>
       <w:r>
-        <w:t>corners2 = cv2.cornerSubPix</w:t>
-      </w:r>
-      <w:proofErr w:type="gramStart"/>
-      <w:r>
-        <w:t>( gray</w:t>
-      </w:r>
-      <w:proofErr w:type="gramEnd"/>
-      <w:r>
-        <w:t>,</w:t>
+        <w:t>corners2 = cv2.cornerSubPix( gray,</w:t>
       </w:r>
       <w:r>
         <w:rPr>
@@ -8176,15 +7374,7 @@
         <w:ind w:left="743"/>
       </w:pPr>
       <w:r>
-        <w:t>criteria</w:t>
-      </w:r>
-      <w:proofErr w:type="gramStart"/>
-      <w:r>
-        <w:t>=(</w:t>
-      </w:r>
-      <w:proofErr w:type="gramEnd"/>
-      <w:r>
-        <w:t>cv2.TERM_CRITERIA_EPS</w:t>
+        <w:t>criteria=(cv2.TERM_CRITERIA_EPS</w:t>
       </w:r>
       <w:r>
         <w:rPr>
@@ -8255,7 +7445,6 @@
         <w:ind w:left="503"/>
       </w:pPr>
       <w:proofErr w:type="spellStart"/>
-      <w:proofErr w:type="gramStart"/>
       <w:r>
         <w:rPr>
           <w:spacing w:val="-2"/>
@@ -8263,7 +7452,6 @@
         <w:t>imgpoints.append</w:t>
       </w:r>
       <w:proofErr w:type="spellEnd"/>
-      <w:proofErr w:type="gramEnd"/>
       <w:r>
         <w:rPr>
           <w:spacing w:val="-2"/>
@@ -8488,12 +7676,10 @@
         <w:spacing w:before="183" w:line="398" w:lineRule="auto"/>
         <w:ind w:left="23" w:right="1702" w:firstLine="480"/>
       </w:pPr>
-      <w:proofErr w:type="gramStart"/>
       <w:r>
         <w:t>print(</w:t>
       </w:r>
       <w:proofErr w:type="spellStart"/>
-      <w:proofErr w:type="gramEnd"/>
       <w:r>
         <w:t>f"Chessboard</w:t>
       </w:r>
@@ -8898,12 +8084,10 @@
         <w:ind w:left="263" w:right="1702"/>
       </w:pPr>
       <w:proofErr w:type="spellStart"/>
-      <w:proofErr w:type="gramStart"/>
       <w:r>
         <w:t>np.savez</w:t>
       </w:r>
       <w:proofErr w:type="spellEnd"/>
-      <w:proofErr w:type="gramEnd"/>
       <w:r>
         <w:t>('</w:t>
       </w:r>
@@ -9001,15 +8185,7 @@
       </w:r>
       <w:proofErr w:type="spellEnd"/>
       <w:r>
-        <w:t xml:space="preserve">) </w:t>
-      </w:r>
-      <w:proofErr w:type="gramStart"/>
-      <w:r>
-        <w:t>print(</w:t>
-      </w:r>
-      <w:proofErr w:type="gramEnd"/>
-      <w:r>
-        <w:t>"Camera matrix:")</w:t>
+        <w:t>) print("Camera matrix:")</w:t>
       </w:r>
     </w:p>
     <w:p>
@@ -9044,13 +8220,8 @@
         <w:spacing w:before="180" w:line="398" w:lineRule="auto"/>
         <w:ind w:left="263" w:right="6159"/>
       </w:pPr>
-      <w:proofErr w:type="gramStart"/>
-      <w:r>
-        <w:t>print(</w:t>
-      </w:r>
-      <w:proofErr w:type="gramEnd"/>
-      <w:r>
-        <w:t>"\</w:t>
+      <w:r>
+        <w:t>print("\</w:t>
       </w:r>
       <w:proofErr w:type="spellStart"/>
       <w:r>
@@ -9106,13 +8277,8 @@
         <w:spacing w:before="183"/>
         <w:ind w:left="263"/>
       </w:pPr>
-      <w:proofErr w:type="gramStart"/>
-      <w:r>
-        <w:t>print(</w:t>
-      </w:r>
-      <w:proofErr w:type="gramEnd"/>
-      <w:r>
-        <w:t>"Not</w:t>
+      <w:r>
+        <w:t>print("Not</w:t>
       </w:r>
       <w:r>
         <w:rPr>
@@ -10361,13 +9527,8 @@
         <w:t xml:space="preserve"> </w:t>
       </w:r>
       <w:r>
-        <w:t>cv2.CascadeClassifier(</w:t>
-      </w:r>
-      <w:proofErr w:type="gramStart"/>
-      <w:r>
-        <w:t>cv2.data.haarcascades</w:t>
-      </w:r>
-      <w:proofErr w:type="gramEnd"/>
+        <w:t>cv2.CascadeClassifier(cv2.data.haarcascades</w:t>
+      </w:r>
       <w:r>
         <w:rPr>
           <w:spacing w:val="-13"/>
@@ -10685,14 +9846,9 @@
       </w:r>
       <w:proofErr w:type="spellStart"/>
       <w:r>
-        <w:t>face_</w:t>
-      </w:r>
-      <w:proofErr w:type="gramStart"/>
-      <w:r>
-        <w:t>cascade.detectMultiScale</w:t>
-      </w:r>
-      <w:proofErr w:type="spellEnd"/>
-      <w:proofErr w:type="gramEnd"/>
+        <w:t>face_cascade.detectMultiScale</w:t>
+      </w:r>
+      <w:proofErr w:type="spellEnd"/>
       <w:r>
         <w:t>(gray,</w:t>
       </w:r>
@@ -10735,13 +9891,8 @@
         <w:t>minSize</w:t>
       </w:r>
       <w:proofErr w:type="spellEnd"/>
-      <w:proofErr w:type="gramStart"/>
-      <w:r>
-        <w:t>=(</w:t>
-      </w:r>
-      <w:proofErr w:type="gramEnd"/>
-      <w:r>
-        <w:t xml:space="preserve">30, </w:t>
+      <w:r>
+        <w:t xml:space="preserve">=(30, </w:t>
       </w:r>
       <w:r>
         <w:rPr>
@@ -11123,7 +10274,6 @@
       <w:pPr>
         <w:pStyle w:val="Heading3"/>
       </w:pPr>
-      <w:proofErr w:type="gramStart"/>
       <w:r>
         <w:t>THEORY</w:t>
       </w:r>
@@ -11139,7 +10289,6 @@
         </w:rPr>
         <w:t>:</w:t>
       </w:r>
-      <w:proofErr w:type="gramEnd"/>
     </w:p>
     <w:p>
       <w:pPr>
@@ -12369,13 +11518,8 @@
         </w:numPr>
         <w:spacing w:before="93"/>
       </w:pPr>
-      <w:proofErr w:type="gramStart"/>
-      <w:r>
-        <w:t>!pip</w:t>
-      </w:r>
-      <w:proofErr w:type="gramEnd"/>
-      <w:r>
-        <w:t xml:space="preserve"> install </w:t>
+      <w:r>
+        <w:t xml:space="preserve">!pip install </w:t>
       </w:r>
       <w:proofErr w:type="spellStart"/>
       <w:r>
@@ -12394,7 +11538,7 @@
           <w:noProof/>
         </w:rPr>
         <w:drawing>
-          <wp:inline distT="0" distB="0" distL="0" distR="0" wp14:anchorId="23045A70" wp14:editId="3D6DEBFB">
+          <wp:inline distT="0" distB="0" distL="0" distR="0" wp14:anchorId="23045A70" wp14:editId="3FC04594">
             <wp:extent cx="5854662" cy="2546350"/>
             <wp:effectExtent l="0" t="0" r="0" b="6350"/>
             <wp:docPr id="485288603" name="Picture 29"/>
@@ -12649,25 +11793,12 @@
         <w:t xml:space="preserve"> </w:t>
       </w:r>
       <w:proofErr w:type="spellStart"/>
-      <w:proofErr w:type="gramStart"/>
-      <w:r>
-        <w:t>os.path</w:t>
-      </w:r>
-      <w:proofErr w:type="gramEnd"/>
-      <w:r>
-        <w:t>.</w:t>
-      </w:r>
-      <w:proofErr w:type="gramStart"/>
-      <w:r>
-        <w:t>join</w:t>
-      </w:r>
-      <w:proofErr w:type="spellEnd"/>
-      <w:r>
-        <w:t>(</w:t>
-      </w:r>
-      <w:proofErr w:type="gramEnd"/>
-      <w:r>
-        <w:t>MODEL_NAME,</w:t>
+      <w:r>
+        <w:t>os.path.join</w:t>
+      </w:r>
+      <w:proofErr w:type="spellEnd"/>
+      <w:r>
+        <w:t>(MODEL_NAME,</w:t>
       </w:r>
       <w:r>
         <w:rPr>
@@ -12686,17 +11817,9 @@
         <w:rPr>
           <w:spacing w:val="-2"/>
         </w:rPr>
-        <w:t>frozen_inference_</w:t>
-      </w:r>
-      <w:proofErr w:type="gramStart"/>
-      <w:r>
-        <w:rPr>
-          <w:spacing w:val="-2"/>
-        </w:rPr>
-        <w:t>graph.pb</w:t>
-      </w:r>
-      <w:proofErr w:type="spellEnd"/>
-      <w:proofErr w:type="gramEnd"/>
+        <w:t>frozen_inference_graph.pb</w:t>
+      </w:r>
+      <w:proofErr w:type="spellEnd"/>
       <w:r>
         <w:rPr>
           <w:spacing w:val="-2"/>
@@ -12767,7 +11890,6 @@
         <w:t xml:space="preserve"> </w:t>
       </w:r>
       <w:proofErr w:type="spellStart"/>
-      <w:proofErr w:type="gramStart"/>
       <w:r>
         <w:rPr>
           <w:spacing w:val="-2"/>
@@ -12775,7 +11897,6 @@
         <w:t>tf.Graph</w:t>
       </w:r>
       <w:proofErr w:type="spellEnd"/>
-      <w:proofErr w:type="gramEnd"/>
       <w:r>
         <w:rPr>
           <w:spacing w:val="-2"/>
@@ -12794,19 +11915,11 @@
       </w:r>
       <w:proofErr w:type="spellStart"/>
       <w:r>
-        <w:t>detection_graph.as_</w:t>
-      </w:r>
-      <w:proofErr w:type="gramStart"/>
-      <w:r>
-        <w:t>default</w:t>
-      </w:r>
-      <w:proofErr w:type="spellEnd"/>
-      <w:r>
-        <w:t>(</w:t>
-      </w:r>
-      <w:proofErr w:type="gramEnd"/>
-      <w:r>
-        <w:t xml:space="preserve">): </w:t>
+        <w:t>detection_graph.as_default</w:t>
+      </w:r>
+      <w:proofErr w:type="spellEnd"/>
+      <w:r>
+        <w:t xml:space="preserve">(): </w:t>
       </w:r>
       <w:proofErr w:type="spellStart"/>
       <w:r>
@@ -12828,21 +11941,8 @@
         </w:rPr>
         <w:t xml:space="preserve"> </w:t>
       </w:r>
-      <w:proofErr w:type="gramStart"/>
-      <w:r>
-        <w:t>tf.compat</w:t>
-      </w:r>
-      <w:proofErr w:type="gramEnd"/>
-      <w:r>
-        <w:t>.v</w:t>
-      </w:r>
-      <w:proofErr w:type="gramStart"/>
-      <w:r>
-        <w:t>1.GraphDef</w:t>
-      </w:r>
-      <w:proofErr w:type="gramEnd"/>
-      <w:r>
-        <w:t>()</w:t>
+      <w:r>
+        <w:t>tf.compat.v1.GraphDef()</w:t>
       </w:r>
     </w:p>
     <w:p>
@@ -12861,134 +11961,101 @@
         <w:t xml:space="preserve"> </w:t>
       </w:r>
       <w:proofErr w:type="spellStart"/>
-      <w:proofErr w:type="gramStart"/>
-      <w:r>
-        <w:t>tf.io.gfile</w:t>
-      </w:r>
-      <w:proofErr w:type="gramEnd"/>
-      <w:r>
-        <w:t>.</w:t>
-      </w:r>
-      <w:proofErr w:type="gramStart"/>
-      <w:r>
-        <w:t>GFile</w:t>
-      </w:r>
-      <w:proofErr w:type="spellEnd"/>
-      <w:r>
+      <w:r>
+        <w:t>tf.io.gfile.GFile</w:t>
+      </w:r>
+      <w:proofErr w:type="spellEnd"/>
+      <w:r>
+        <w:t>(PATH_TO_CKPT,</w:t>
+      </w:r>
+      <w:r>
+        <w:rPr>
+          <w:spacing w:val="-9"/>
+        </w:rPr>
+        <w:t xml:space="preserve"> </w:t>
+      </w:r>
+      <w:r>
+        <w:t>'</w:t>
+      </w:r>
+      <w:proofErr w:type="spellStart"/>
+      <w:r>
+        <w:t>rb</w:t>
+      </w:r>
+      <w:proofErr w:type="spellEnd"/>
+      <w:r>
+        <w:t>')</w:t>
+      </w:r>
+      <w:r>
+        <w:rPr>
+          <w:spacing w:val="-9"/>
+        </w:rPr>
+        <w:t xml:space="preserve"> </w:t>
+      </w:r>
+      <w:r>
+        <w:t>as</w:t>
+      </w:r>
+      <w:r>
+        <w:rPr>
+          <w:spacing w:val="-9"/>
+        </w:rPr>
+        <w:t xml:space="preserve"> </w:t>
+      </w:r>
+      <w:r>
+        <w:t xml:space="preserve">fid: </w:t>
+      </w:r>
+      <w:proofErr w:type="spellStart"/>
+      <w:r>
+        <w:t>serialized_graph</w:t>
+      </w:r>
+      <w:proofErr w:type="spellEnd"/>
+      <w:r>
+        <w:t xml:space="preserve"> = </w:t>
+      </w:r>
+      <w:proofErr w:type="spellStart"/>
+      <w:r>
+        <w:t>fid.read</w:t>
+      </w:r>
+      <w:proofErr w:type="spellEnd"/>
+      <w:r>
+        <w:t xml:space="preserve">() </w:t>
+      </w:r>
+      <w:proofErr w:type="spellStart"/>
+      <w:r>
+        <w:rPr>
+          <w:spacing w:val="-2"/>
+        </w:rPr>
+        <w:t>od_graph_def.ParseFromString</w:t>
+      </w:r>
+      <w:proofErr w:type="spellEnd"/>
+      <w:r>
+        <w:rPr>
+          <w:spacing w:val="-2"/>
+        </w:rPr>
         <w:t>(</w:t>
       </w:r>
-      <w:proofErr w:type="gramEnd"/>
-      <w:r>
-        <w:t>PATH_TO_CKPT,</w:t>
-      </w:r>
-      <w:r>
-        <w:rPr>
-          <w:spacing w:val="-9"/>
-        </w:rPr>
-        <w:t xml:space="preserve"> </w:t>
-      </w:r>
-      <w:r>
-        <w:t>'</w:t>
-      </w:r>
-      <w:proofErr w:type="spellStart"/>
-      <w:r>
-        <w:t>rb</w:t>
-      </w:r>
-      <w:proofErr w:type="spellEnd"/>
-      <w:r>
-        <w:t>')</w:t>
-      </w:r>
-      <w:r>
-        <w:rPr>
-          <w:spacing w:val="-9"/>
-        </w:rPr>
-        <w:t xml:space="preserve"> </w:t>
-      </w:r>
-      <w:r>
-        <w:t>as</w:t>
-      </w:r>
-      <w:r>
-        <w:rPr>
-          <w:spacing w:val="-9"/>
-        </w:rPr>
-        <w:t xml:space="preserve"> </w:t>
-      </w:r>
-      <w:r>
-        <w:t xml:space="preserve">fid: </w:t>
-      </w:r>
-      <w:proofErr w:type="spellStart"/>
-      <w:r>
+      <w:proofErr w:type="spellStart"/>
+      <w:r>
+        <w:rPr>
+          <w:spacing w:val="-2"/>
+        </w:rPr>
         <w:t>serialized_graph</w:t>
       </w:r>
       <w:proofErr w:type="spellEnd"/>
       <w:r>
-        <w:t xml:space="preserve"> = </w:t>
-      </w:r>
-      <w:proofErr w:type="spellStart"/>
-      <w:proofErr w:type="gramStart"/>
-      <w:r>
-        <w:t>fid.read</w:t>
-      </w:r>
-      <w:proofErr w:type="spellEnd"/>
-      <w:proofErr w:type="gramEnd"/>
-      <w:r>
-        <w:t xml:space="preserve">() </w:t>
-      </w:r>
-      <w:proofErr w:type="spellStart"/>
-      <w:r>
-        <w:rPr>
-          <w:spacing w:val="-2"/>
-        </w:rPr>
-        <w:t>od_graph_</w:t>
-      </w:r>
-      <w:proofErr w:type="gramStart"/>
-      <w:r>
-        <w:rPr>
-          <w:spacing w:val="-2"/>
-        </w:rPr>
-        <w:t>def.ParseFromString</w:t>
-      </w:r>
-      <w:proofErr w:type="spellEnd"/>
-      <w:proofErr w:type="gramEnd"/>
-      <w:r>
-        <w:rPr>
-          <w:spacing w:val="-2"/>
-        </w:rPr>
+        <w:rPr>
+          <w:spacing w:val="-2"/>
+        </w:rPr>
+        <w:t xml:space="preserve">) </w:t>
+      </w:r>
+      <w:proofErr w:type="spellStart"/>
+      <w:r>
+        <w:t>tf.import_graph_def</w:t>
+      </w:r>
+      <w:proofErr w:type="spellEnd"/>
+      <w:r>
         <w:t>(</w:t>
       </w:r>
       <w:proofErr w:type="spellStart"/>
-      <w:r>
-        <w:rPr>
-          <w:spacing w:val="-2"/>
-        </w:rPr>
-        <w:t>serialized_graph</w:t>
-      </w:r>
-      <w:proofErr w:type="spellEnd"/>
-      <w:r>
-        <w:rPr>
-          <w:spacing w:val="-2"/>
-        </w:rPr>
-        <w:t xml:space="preserve">) </w:t>
-      </w:r>
-      <w:proofErr w:type="spellStart"/>
-      <w:proofErr w:type="gramStart"/>
-      <w:r>
-        <w:t>tf.import</w:t>
-      </w:r>
-      <w:proofErr w:type="gramEnd"/>
-      <w:r>
-        <w:t>_graph_</w:t>
-      </w:r>
-      <w:proofErr w:type="gramStart"/>
-      <w:r>
-        <w:t>def</w:t>
-      </w:r>
-      <w:proofErr w:type="spellEnd"/>
-      <w:r>
-        <w:t>(</w:t>
-      </w:r>
-      <w:proofErr w:type="spellStart"/>
-      <w:proofErr w:type="gramEnd"/>
       <w:r>
         <w:t>od_graph_def</w:t>
       </w:r>
@@ -13070,25 +12137,12 @@
         <w:t xml:space="preserve"> </w:t>
       </w:r>
       <w:proofErr w:type="spellStart"/>
-      <w:proofErr w:type="gramStart"/>
-      <w:r>
-        <w:t>os.path</w:t>
-      </w:r>
-      <w:proofErr w:type="gramEnd"/>
-      <w:r>
-        <w:t>.</w:t>
-      </w:r>
-      <w:proofErr w:type="gramStart"/>
-      <w:r>
-        <w:t>join</w:t>
-      </w:r>
-      <w:proofErr w:type="spellEnd"/>
-      <w:r>
-        <w:t>(</w:t>
-      </w:r>
-      <w:proofErr w:type="gramEnd"/>
-      <w:r>
-        <w:t>'data',</w:t>
+      <w:r>
+        <w:t>os.path.join</w:t>
+      </w:r>
+      <w:proofErr w:type="spellEnd"/>
+      <w:r>
+        <w:t>('data',</w:t>
       </w:r>
       <w:r>
         <w:rPr>
@@ -13101,17 +12155,9 @@
         <w:rPr>
           <w:spacing w:val="-2"/>
         </w:rPr>
-        <w:t>mscoco_label_</w:t>
-      </w:r>
-      <w:proofErr w:type="gramStart"/>
-      <w:r>
-        <w:rPr>
-          <w:spacing w:val="-2"/>
-        </w:rPr>
-        <w:t>map.pbtxt</w:t>
-      </w:r>
-      <w:proofErr w:type="spellEnd"/>
-      <w:proofErr w:type="gramEnd"/>
+        <w:t>mscoco_label_map.pbtxt</w:t>
+      </w:r>
+      <w:proofErr w:type="spellEnd"/>
     </w:p>
     <w:p>
       <w:pPr>
@@ -13197,13 +12243,8 @@
         </w:rPr>
         <w:t xml:space="preserve"> </w:t>
       </w:r>
-      <w:proofErr w:type="gramStart"/>
-      <w:r>
-        <w:t>open(</w:t>
-      </w:r>
-      <w:proofErr w:type="gramEnd"/>
-      <w:r>
-        <w:t>PATH_TO_LABELS,</w:t>
+      <w:r>
+        <w:t>open(PATH_TO_LABELS,</w:t>
       </w:r>
       <w:r>
         <w:rPr>
@@ -13233,12 +12274,10 @@
         <w:t xml:space="preserve">f: lines = </w:t>
       </w:r>
       <w:proofErr w:type="spellStart"/>
-      <w:proofErr w:type="gramStart"/>
       <w:r>
         <w:t>f.readlines</w:t>
       </w:r>
       <w:proofErr w:type="spellEnd"/>
-      <w:proofErr w:type="gramEnd"/>
       <w:r>
         <w:t>()</w:t>
       </w:r>
@@ -13316,30 +12355,12 @@
         <w:t>int(</w:t>
       </w:r>
       <w:proofErr w:type="spellStart"/>
-      <w:proofErr w:type="gramStart"/>
       <w:r>
         <w:t>line.strip</w:t>
       </w:r>
       <w:proofErr w:type="spellEnd"/>
-      <w:proofErr w:type="gramEnd"/>
-      <w:r>
-        <w:t>(</w:t>
-      </w:r>
-      <w:proofErr w:type="gramStart"/>
-      <w:r>
-        <w:t>).split</w:t>
-      </w:r>
-      <w:proofErr w:type="gramEnd"/>
-      <w:r>
-        <w:t>(':</w:t>
-      </w:r>
-      <w:proofErr w:type="gramStart"/>
-      <w:r>
-        <w:t>')[</w:t>
-      </w:r>
-      <w:proofErr w:type="gramEnd"/>
-      <w:r>
-        <w:t>1]) if '</w:t>
+      <w:r>
+        <w:t>().split(':')[1]) if '</w:t>
       </w:r>
       <w:proofErr w:type="spellStart"/>
       <w:r>
@@ -13375,46 +12396,12 @@
         <w:t xml:space="preserve"> </w:t>
       </w:r>
       <w:proofErr w:type="spellStart"/>
-      <w:proofErr w:type="gramStart"/>
       <w:r>
         <w:t>line.strip</w:t>
       </w:r>
       <w:proofErr w:type="spellEnd"/>
-      <w:proofErr w:type="gramEnd"/>
-      <w:r>
-        <w:t>(</w:t>
-      </w:r>
-      <w:proofErr w:type="gramStart"/>
-      <w:r>
-        <w:t>).split</w:t>
-      </w:r>
-      <w:proofErr w:type="gramEnd"/>
-      <w:r>
-        <w:t>(':</w:t>
-      </w:r>
-      <w:proofErr w:type="gramStart"/>
-      <w:r>
-        <w:t>')[</w:t>
-      </w:r>
-      <w:proofErr w:type="gramEnd"/>
-      <w:r>
-        <w:t>1</w:t>
-      </w:r>
-      <w:proofErr w:type="gramStart"/>
-      <w:r>
-        <w:t>].strip</w:t>
-      </w:r>
-      <w:proofErr w:type="gramEnd"/>
-      <w:r>
-        <w:t>(</w:t>
-      </w:r>
-      <w:proofErr w:type="gramStart"/>
-      <w:r>
-        <w:t>).strip</w:t>
-      </w:r>
-      <w:proofErr w:type="gramEnd"/>
-      <w:r>
-        <w:t xml:space="preserve">('"') </w:t>
+      <w:r>
+        <w:t xml:space="preserve">().split(':')[1].strip().strip('"') </w:t>
       </w:r>
       <w:proofErr w:type="spellStart"/>
       <w:r>
@@ -13522,28 +12509,14 @@
         <w:rPr>
           <w:spacing w:val="-2"/>
         </w:rPr>
-        <w:t>detection_graph.as_</w:t>
-      </w:r>
-      <w:proofErr w:type="gramStart"/>
-      <w:r>
-        <w:rPr>
-          <w:spacing w:val="-2"/>
-        </w:rPr>
-        <w:t>default</w:t>
-      </w:r>
-      <w:proofErr w:type="spellEnd"/>
-      <w:r>
-        <w:rPr>
-          <w:spacing w:val="-2"/>
-        </w:rPr>
-        <w:t>(</w:t>
-      </w:r>
-      <w:proofErr w:type="gramEnd"/>
-      <w:r>
-        <w:rPr>
-          <w:spacing w:val="-2"/>
-        </w:rPr>
-        <w:t>):</w:t>
+        <w:t>detection_graph.as_default</w:t>
+      </w:r>
+      <w:proofErr w:type="spellEnd"/>
+      <w:r>
+        <w:rPr>
+          <w:spacing w:val="-2"/>
+        </w:rPr>
+        <w:t>():</w:t>
       </w:r>
     </w:p>
     <w:p>
@@ -13561,21 +12534,8 @@
         </w:rPr>
         <w:t xml:space="preserve"> </w:t>
       </w:r>
-      <w:proofErr w:type="gramStart"/>
-      <w:r>
-        <w:t>tf.compat</w:t>
-      </w:r>
-      <w:proofErr w:type="gramEnd"/>
-      <w:r>
-        <w:t>.v</w:t>
-      </w:r>
-      <w:proofErr w:type="gramStart"/>
-      <w:r>
-        <w:t>1.Session</w:t>
-      </w:r>
-      <w:proofErr w:type="gramEnd"/>
-      <w:r>
-        <w:t>(graph=</w:t>
+      <w:r>
+        <w:t>tf.compat.v1.Session(graph=</w:t>
       </w:r>
       <w:proofErr w:type="spellStart"/>
       <w:r>
@@ -13764,25 +12724,12 @@
         <w:t xml:space="preserve"> </w:t>
       </w:r>
       <w:proofErr w:type="spellStart"/>
-      <w:proofErr w:type="gramStart"/>
-      <w:r>
-        <w:t>np.expand</w:t>
-      </w:r>
-      <w:proofErr w:type="gramEnd"/>
-      <w:r>
-        <w:t>_</w:t>
-      </w:r>
-      <w:proofErr w:type="gramStart"/>
-      <w:r>
-        <w:t>dims</w:t>
-      </w:r>
-      <w:proofErr w:type="spellEnd"/>
-      <w:r>
-        <w:t>(</w:t>
-      </w:r>
-      <w:proofErr w:type="gramEnd"/>
-      <w:r>
-        <w:t>image,</w:t>
+      <w:r>
+        <w:t>np.expand_dims</w:t>
+      </w:r>
+      <w:proofErr w:type="spellEnd"/>
+      <w:r>
+        <w:t>(image,</w:t>
       </w:r>
       <w:r>
         <w:rPr>
@@ -14329,17 +13276,12 @@
         <w:t xml:space="preserve"> </w:t>
       </w:r>
       <w:proofErr w:type="spellStart"/>
-      <w:proofErr w:type="gramStart"/>
       <w:r>
         <w:t>sess.run</w:t>
       </w:r>
       <w:proofErr w:type="spellEnd"/>
       <w:r>
-        <w:t>(</w:t>
-      </w:r>
-      <w:proofErr w:type="gramEnd"/>
-      <w:r>
-        <w:t>[boxes,</w:t>
+        <w:t>([boxes,</w:t>
       </w:r>
       <w:r>
         <w:rPr>
@@ -14374,25 +13316,18 @@
         <w:t>num_detections</w:t>
       </w:r>
       <w:proofErr w:type="spellEnd"/>
-      <w:proofErr w:type="gramStart"/>
       <w:r>
         <w:t>],</w:t>
       </w:r>
       <w:proofErr w:type="spellStart"/>
       <w:r>
-        <w:t>feed</w:t>
-      </w:r>
-      <w:proofErr w:type="gramEnd"/>
-      <w:r>
-        <w:t>_dict</w:t>
-      </w:r>
-      <w:proofErr w:type="spellEnd"/>
-      <w:proofErr w:type="gramStart"/>
+        <w:t>feed_dict</w:t>
+      </w:r>
+      <w:proofErr w:type="spellEnd"/>
       <w:r>
         <w:t>={</w:t>
       </w:r>
       <w:proofErr w:type="spellStart"/>
-      <w:proofErr w:type="gramEnd"/>
       <w:r>
         <w:t>image_tensor</w:t>
       </w:r>
@@ -14456,21 +13391,7 @@
         <w:rPr>
           <w:spacing w:val="-2"/>
         </w:rPr>
-        <w:t>(</w:t>
-      </w:r>
-      <w:proofErr w:type="gramStart"/>
-      <w:r>
-        <w:rPr>
-          <w:spacing w:val="-2"/>
-        </w:rPr>
-        <w:t>scores[</w:t>
-      </w:r>
-      <w:proofErr w:type="gramEnd"/>
-      <w:r>
-        <w:rPr>
-          <w:spacing w:val="-2"/>
-        </w:rPr>
-        <w:t>0])):</w:t>
+        <w:t>(scores[0])):</w:t>
       </w:r>
     </w:p>
     <w:p>
@@ -14624,19 +13545,11 @@
       </w:r>
       <w:proofErr w:type="spellStart"/>
       <w:r>
-        <w:t>class_</w:t>
-      </w:r>
-      <w:proofErr w:type="gramStart"/>
-      <w:r>
-        <w:t>id</w:t>
-      </w:r>
-      <w:proofErr w:type="spellEnd"/>
-      <w:r>
-        <w:t>][</w:t>
-      </w:r>
-      <w:proofErr w:type="gramEnd"/>
-      <w:r>
-        <w:t>'name'] score = float(scores[0][</w:t>
+        <w:t>class_id</w:t>
+      </w:r>
+      <w:proofErr w:type="spellEnd"/>
+      <w:r>
+        <w:t>]['name'] score = float(scores[0][</w:t>
       </w:r>
       <w:proofErr w:type="spellStart"/>
       <w:r>
@@ -14793,12 +13706,10 @@
         <w:t xml:space="preserve"> </w:t>
       </w:r>
       <w:proofErr w:type="spellStart"/>
-      <w:proofErr w:type="gramStart"/>
       <w:r>
         <w:t>image.shape</w:t>
       </w:r>
       <w:proofErr w:type="spellEnd"/>
-      <w:proofErr w:type="gramEnd"/>
       <w:r>
         <w:t>[1],</w:t>
       </w:r>
@@ -14829,12 +13740,10 @@
         <w:t xml:space="preserve"> </w:t>
       </w:r>
       <w:proofErr w:type="spellStart"/>
-      <w:proofErr w:type="gramStart"/>
       <w:r>
         <w:t>image.shape</w:t>
       </w:r>
       <w:proofErr w:type="spellEnd"/>
-      <w:proofErr w:type="gramEnd"/>
       <w:r>
         <w:t xml:space="preserve">[1], </w:t>
       </w:r>
@@ -14863,12 +13772,10 @@
         <w:t xml:space="preserve"> </w:t>
       </w:r>
       <w:proofErr w:type="spellStart"/>
-      <w:proofErr w:type="gramStart"/>
       <w:r>
         <w:t>image.shape</w:t>
       </w:r>
       <w:proofErr w:type="spellEnd"/>
-      <w:proofErr w:type="gramEnd"/>
       <w:r>
         <w:t>[0],</w:t>
       </w:r>
@@ -14893,7 +13800,6 @@
         <w:t xml:space="preserve">* </w:t>
       </w:r>
       <w:proofErr w:type="spellStart"/>
-      <w:proofErr w:type="gramStart"/>
       <w:r>
         <w:rPr>
           <w:spacing w:val="-2"/>
@@ -14901,7 +13807,6 @@
         <w:t>image.shape</w:t>
       </w:r>
       <w:proofErr w:type="spellEnd"/>
-      <w:proofErr w:type="gramEnd"/>
       <w:r>
         <w:rPr>
           <w:spacing w:val="-2"/>
@@ -15019,15 +13924,7 @@
         <w:t xml:space="preserve"> </w:t>
       </w:r>
       <w:r>
-        <w:t>{:.2f}</w:t>
-      </w:r>
-      <w:proofErr w:type="gramStart"/>
-      <w:r>
-        <w:t>'.format</w:t>
-      </w:r>
-      <w:proofErr w:type="gramEnd"/>
-      <w:r>
-        <w:t>(</w:t>
+        <w:t>{:.2f}'.format(</w:t>
       </w:r>
       <w:proofErr w:type="spellStart"/>
       <w:r>
@@ -15061,13 +13958,8 @@
         </w:rPr>
         <w:t xml:space="preserve"> </w:t>
       </w:r>
-      <w:proofErr w:type="gramStart"/>
-      <w:r>
-        <w:t>int(</w:t>
-      </w:r>
-      <w:proofErr w:type="gramEnd"/>
-      <w:r>
-        <w:t>top</w:t>
+      <w:r>
+        <w:t>int(top</w:t>
       </w:r>
       <w:r>
         <w:rPr>
@@ -16267,13 +15159,8 @@
         <w:t xml:space="preserve"> </w:t>
       </w:r>
       <w:r>
-        <w:t>cv2.CascadeClassifier(</w:t>
-      </w:r>
-      <w:proofErr w:type="gramStart"/>
-      <w:r>
-        <w:t>cv2.data.haarcascades</w:t>
-      </w:r>
-      <w:proofErr w:type="gramEnd"/>
+        <w:t>cv2.CascadeClassifier(cv2.data.haarcascades</w:t>
+      </w:r>
       <w:r>
         <w:rPr>
           <w:spacing w:val="-13"/>
@@ -16588,14 +15475,9 @@
       </w:r>
       <w:proofErr w:type="spellStart"/>
       <w:r>
-        <w:t>pedestrian_</w:t>
-      </w:r>
-      <w:proofErr w:type="gramStart"/>
-      <w:r>
-        <w:t>cascade.detectMultiScale</w:t>
-      </w:r>
-      <w:proofErr w:type="spellEnd"/>
-      <w:proofErr w:type="gramEnd"/>
+        <w:t>pedestrian_cascade.detectMultiScale</w:t>
+      </w:r>
+      <w:proofErr w:type="spellEnd"/>
       <w:r>
         <w:t>(gray,</w:t>
       </w:r>
@@ -16632,13 +15514,8 @@
         <w:t>minSize</w:t>
       </w:r>
       <w:proofErr w:type="spellEnd"/>
-      <w:proofErr w:type="gramStart"/>
-      <w:r>
-        <w:t>=(</w:t>
-      </w:r>
-      <w:proofErr w:type="gramEnd"/>
-      <w:r>
-        <w:t>5, 5))</w:t>
+      <w:r>
+        <w:t>=(5, 5))</w:t>
       </w:r>
     </w:p>
     <w:p>
@@ -19254,13 +18131,8 @@
         <w:t xml:space="preserve"> </w:t>
       </w:r>
       <w:proofErr w:type="spellStart"/>
-      <w:proofErr w:type="gramStart"/>
-      <w:r>
-        <w:t>sklearn.linear</w:t>
-      </w:r>
-      <w:proofErr w:type="gramEnd"/>
-      <w:r>
-        <w:t>_model</w:t>
+      <w:r>
+        <w:t>sklearn.linear_model</w:t>
       </w:r>
       <w:proofErr w:type="spellEnd"/>
       <w:r>
@@ -19287,12 +18159,10 @@
         <w:t xml:space="preserve"> import </w:t>
       </w:r>
       <w:proofErr w:type="spellStart"/>
-      <w:proofErr w:type="gramStart"/>
       <w:r>
         <w:t>matplotlib.pyplot</w:t>
       </w:r>
       <w:proofErr w:type="spellEnd"/>
-      <w:proofErr w:type="gramEnd"/>
       <w:r>
         <w:t xml:space="preserve"> as </w:t>
       </w:r>
@@ -19363,40 +18233,18 @@
         <w:t xml:space="preserve">points </w:t>
       </w:r>
       <w:proofErr w:type="spellStart"/>
-      <w:proofErr w:type="gramStart"/>
-      <w:r>
-        <w:rPr>
-          <w:spacing w:val="-2"/>
-        </w:rPr>
-        <w:t>np.random</w:t>
-      </w:r>
-      <w:proofErr w:type="gramEnd"/>
-      <w:r>
-        <w:rPr>
-          <w:spacing w:val="-2"/>
-        </w:rPr>
-        <w:t>.</w:t>
-      </w:r>
-      <w:proofErr w:type="gramStart"/>
-      <w:r>
-        <w:rPr>
-          <w:spacing w:val="-2"/>
-        </w:rPr>
-        <w:t>seed</w:t>
-      </w:r>
-      <w:proofErr w:type="spellEnd"/>
-      <w:r>
-        <w:rPr>
-          <w:spacing w:val="-2"/>
-        </w:rPr>
-        <w:t>(</w:t>
-      </w:r>
-      <w:proofErr w:type="gramEnd"/>
-      <w:r>
-        <w:rPr>
-          <w:spacing w:val="-2"/>
-        </w:rPr>
-        <w:t>0)</w:t>
+      <w:r>
+        <w:rPr>
+          <w:spacing w:val="-2"/>
+        </w:rPr>
+        <w:t>np.random.seed</w:t>
+      </w:r>
+      <w:proofErr w:type="spellEnd"/>
+      <w:r>
+        <w:rPr>
+          <w:spacing w:val="-2"/>
+        </w:rPr>
+        <w:t>(0)</w:t>
       </w:r>
     </w:p>
     <w:p>
@@ -19424,25 +18272,12 @@
         <w:t xml:space="preserve"> </w:t>
       </w:r>
       <w:proofErr w:type="spellStart"/>
-      <w:proofErr w:type="gramStart"/>
-      <w:r>
-        <w:t>np.random</w:t>
-      </w:r>
-      <w:proofErr w:type="gramEnd"/>
-      <w:r>
-        <w:t>.</w:t>
-      </w:r>
-      <w:proofErr w:type="gramStart"/>
-      <w:r>
-        <w:t>uniform</w:t>
-      </w:r>
-      <w:proofErr w:type="spellEnd"/>
-      <w:r>
-        <w:t>(</w:t>
-      </w:r>
-      <w:proofErr w:type="gramEnd"/>
-      <w:r>
-        <w:t>0,</w:t>
+      <w:r>
+        <w:t>np.random.uniform</w:t>
+      </w:r>
+      <w:proofErr w:type="spellEnd"/>
+      <w:r>
+        <w:t>(0,</w:t>
       </w:r>
       <w:r>
         <w:rPr>
@@ -19503,25 +18338,12 @@
         <w:t xml:space="preserve"> </w:t>
       </w:r>
       <w:proofErr w:type="spellStart"/>
-      <w:proofErr w:type="gramStart"/>
-      <w:r>
-        <w:t>np.random</w:t>
-      </w:r>
-      <w:proofErr w:type="gramEnd"/>
-      <w:r>
-        <w:t>.</w:t>
-      </w:r>
-      <w:proofErr w:type="gramStart"/>
-      <w:r>
-        <w:t>normal</w:t>
-      </w:r>
-      <w:proofErr w:type="spellEnd"/>
-      <w:r>
-        <w:t>(</w:t>
-      </w:r>
-      <w:proofErr w:type="gramEnd"/>
-      <w:r>
-        <w:t>0, 1,</w:t>
+      <w:r>
+        <w:t>np.random.normal</w:t>
+      </w:r>
+      <w:proofErr w:type="spellEnd"/>
+      <w:r>
+        <w:t>(0, 1,</w:t>
       </w:r>
       <w:r>
         <w:rPr>
@@ -19584,25 +18406,12 @@
         <w:t xml:space="preserve"> </w:t>
       </w:r>
       <w:proofErr w:type="spellStart"/>
-      <w:proofErr w:type="gramStart"/>
-      <w:r>
-        <w:t>np.random</w:t>
-      </w:r>
-      <w:proofErr w:type="gramEnd"/>
-      <w:r>
-        <w:t>.</w:t>
-      </w:r>
-      <w:proofErr w:type="gramStart"/>
-      <w:r>
-        <w:t>choice</w:t>
-      </w:r>
-      <w:proofErr w:type="spellEnd"/>
-      <w:r>
-        <w:t>(</w:t>
-      </w:r>
-      <w:proofErr w:type="gramEnd"/>
-      <w:r>
-        <w:t>100,</w:t>
+      <w:r>
+        <w:t>np.random.choice</w:t>
+      </w:r>
+      <w:proofErr w:type="spellEnd"/>
+      <w:r>
+        <w:t>(100,</w:t>
       </w:r>
       <w:r>
         <w:rPr>
@@ -19631,25 +18440,12 @@
         <w:t xml:space="preserve">] += 10 * </w:t>
       </w:r>
       <w:proofErr w:type="spellStart"/>
-      <w:proofErr w:type="gramStart"/>
-      <w:r>
-        <w:t>np.random</w:t>
-      </w:r>
-      <w:proofErr w:type="gramEnd"/>
-      <w:r>
-        <w:t>.</w:t>
-      </w:r>
-      <w:proofErr w:type="gramStart"/>
-      <w:r>
-        <w:t>normal</w:t>
-      </w:r>
-      <w:proofErr w:type="spellEnd"/>
-      <w:r>
-        <w:t>(</w:t>
-      </w:r>
-      <w:proofErr w:type="gramEnd"/>
-      <w:r>
-        <w:t>0, 1, 20)</w:t>
+      <w:r>
+        <w:t>np.random.normal</w:t>
+      </w:r>
+      <w:proofErr w:type="spellEnd"/>
+      <w:r>
+        <w:t>(0, 1, 20)</w:t>
       </w:r>
     </w:p>
     <w:p>
@@ -19713,20 +18509,13 @@
         <w:t xml:space="preserve">RANSAC data = </w:t>
       </w:r>
       <w:proofErr w:type="spellStart"/>
-      <w:proofErr w:type="gramStart"/>
       <w:r>
         <w:t>np.vstack</w:t>
       </w:r>
       <w:proofErr w:type="spellEnd"/>
-      <w:proofErr w:type="gramEnd"/>
-      <w:r>
-        <w:t>((x, y)</w:t>
-      </w:r>
-      <w:proofErr w:type="gramStart"/>
-      <w:r>
-        <w:t>).T</w:t>
-      </w:r>
-      <w:proofErr w:type="gramEnd"/>
+      <w:r>
+        <w:t>((x, y)).T</w:t>
+      </w:r>
     </w:p>
     <w:p>
       <w:pPr>
@@ -19802,17 +18591,12 @@
         <w:t xml:space="preserve"> = </w:t>
       </w:r>
       <w:proofErr w:type="spellStart"/>
-      <w:proofErr w:type="gramStart"/>
       <w:r>
         <w:t>RANSACRegressor</w:t>
       </w:r>
       <w:proofErr w:type="spellEnd"/>
       <w:r>
-        <w:t>(</w:t>
-      </w:r>
-      <w:proofErr w:type="gramEnd"/>
-      <w:r>
-        <w:t>)</w:t>
+        <w:t>()</w:t>
       </w:r>
     </w:p>
     <w:p>
@@ -19862,23 +18646,13 @@
         <w:ind w:left="23"/>
       </w:pPr>
       <w:proofErr w:type="spellStart"/>
-      <w:proofErr w:type="gramStart"/>
       <w:r>
         <w:t>ransac.fit</w:t>
       </w:r>
       <w:proofErr w:type="spellEnd"/>
       <w:r>
-        <w:t>(</w:t>
-      </w:r>
-      <w:proofErr w:type="gramEnd"/>
-      <w:r>
-        <w:t>data</w:t>
-      </w:r>
-      <w:proofErr w:type="gramStart"/>
-      <w:r>
-        <w:t>[:,</w:t>
-      </w:r>
-      <w:proofErr w:type="gramEnd"/>
+        <w:t>(data[:,</w:t>
+      </w:r>
       <w:r>
         <w:rPr>
           <w:spacing w:val="-4"/>
@@ -19886,15 +18660,7 @@
         <w:t xml:space="preserve"> </w:t>
       </w:r>
       <w:r>
-        <w:t>0</w:t>
-      </w:r>
-      <w:proofErr w:type="gramStart"/>
-      <w:r>
-        <w:t>].reshape</w:t>
-      </w:r>
-      <w:proofErr w:type="gramEnd"/>
-      <w:r>
-        <w:t>(-1,</w:t>
+        <w:t>0].reshape(-1,</w:t>
       </w:r>
       <w:r>
         <w:rPr>
@@ -19912,13 +18678,8 @@
         <w:t xml:space="preserve"> </w:t>
       </w:r>
       <w:r>
-        <w:t>data</w:t>
-      </w:r>
-      <w:proofErr w:type="gramStart"/>
-      <w:r>
-        <w:t>[:,</w:t>
-      </w:r>
-      <w:proofErr w:type="gramEnd"/>
+        <w:t>data[:,</w:t>
+      </w:r>
       <w:r>
         <w:rPr>
           <w:spacing w:val="-1"/>
@@ -19945,15 +18706,7 @@
         <w:ind w:left="23" w:right="5433"/>
       </w:pPr>
       <w:r>
-        <w:t xml:space="preserve"># Extract the inliers and </w:t>
-      </w:r>
-      <w:proofErr w:type="gramStart"/>
-      <w:r>
-        <w:t>outliers</w:t>
-      </w:r>
-      <w:proofErr w:type="gramEnd"/>
-      <w:r>
-        <w:t xml:space="preserve"> </w:t>
+        <w:t xml:space="preserve"># Extract the inliers and outliers </w:t>
       </w:r>
       <w:proofErr w:type="spellStart"/>
       <w:r>
@@ -19964,13 +18717,8 @@
         <w:t xml:space="preserve"> = </w:t>
       </w:r>
       <w:proofErr w:type="spellStart"/>
-      <w:proofErr w:type="gramStart"/>
-      <w:r>
-        <w:t>ransac.inlier</w:t>
-      </w:r>
-      <w:proofErr w:type="gramEnd"/>
-      <w:r>
-        <w:t>_mask</w:t>
+      <w:r>
+        <w:t>ransac.inlier_mask</w:t>
       </w:r>
       <w:proofErr w:type="spellEnd"/>
       <w:r>
@@ -19997,13 +18745,8 @@
         <w:t xml:space="preserve"> </w:t>
       </w:r>
       <w:proofErr w:type="spellStart"/>
-      <w:proofErr w:type="gramStart"/>
-      <w:r>
-        <w:t>np.logical</w:t>
-      </w:r>
-      <w:proofErr w:type="gramEnd"/>
-      <w:r>
-        <w:t>_not</w:t>
+      <w:r>
+        <w:t>np.logical_not</w:t>
       </w:r>
       <w:proofErr w:type="spellEnd"/>
       <w:r>
@@ -20059,7 +18802,6 @@
         </w:rPr>
         <w:t xml:space="preserve"> </w:t>
       </w:r>
-      <w:proofErr w:type="gramStart"/>
       <w:r>
         <w:t>ransac.estimator_.</w:t>
       </w:r>
@@ -20069,11 +18811,7 @@
       </w:r>
       <w:proofErr w:type="spellEnd"/>
       <w:r>
-        <w:t>_[</w:t>
-      </w:r>
-      <w:proofErr w:type="gramEnd"/>
-      <w:r>
-        <w:t>0]</w:t>
+        <w:t>_[0]</w:t>
       </w:r>
     </w:p>
     <w:p>
@@ -20103,7 +18841,6 @@
         <w:t xml:space="preserve"> </w:t>
       </w:r>
       <w:proofErr w:type="spellStart"/>
-      <w:proofErr w:type="gramStart"/>
       <w:r>
         <w:rPr>
           <w:spacing w:val="-2"/>
@@ -20111,7 +18848,6 @@
         <w:t>ransac.estimator_.intercept</w:t>
       </w:r>
       <w:proofErr w:type="spellEnd"/>
-      <w:proofErr w:type="gramEnd"/>
       <w:r>
         <w:rPr>
           <w:spacing w:val="-2"/>
@@ -20165,28 +18901,21 @@
         <w:ind w:left="23"/>
       </w:pPr>
       <w:proofErr w:type="spellStart"/>
-      <w:proofErr w:type="gramStart"/>
       <w:r>
         <w:t>plt.scatter</w:t>
       </w:r>
       <w:proofErr w:type="spellEnd"/>
-      <w:proofErr w:type="gramEnd"/>
       <w:r>
         <w:t>(data[</w:t>
       </w:r>
       <w:proofErr w:type="spellStart"/>
       <w:r>
-        <w:t>inlier_</w:t>
-      </w:r>
-      <w:proofErr w:type="gramStart"/>
-      <w:r>
-        <w:t>mask</w:t>
+        <w:t>inlier_mask</w:t>
       </w:r>
       <w:proofErr w:type="spellEnd"/>
       <w:r>
         <w:t>][:,</w:t>
       </w:r>
-      <w:proofErr w:type="gramEnd"/>
       <w:r>
         <w:rPr>
           <w:spacing w:val="-3"/>
@@ -20207,17 +18936,12 @@
       </w:r>
       <w:proofErr w:type="spellStart"/>
       <w:r>
-        <w:t>inlier_</w:t>
-      </w:r>
-      <w:proofErr w:type="gramStart"/>
-      <w:r>
-        <w:t>mask</w:t>
+        <w:t>inlier_mask</w:t>
       </w:r>
       <w:proofErr w:type="spellEnd"/>
       <w:r>
         <w:t>][:,</w:t>
       </w:r>
-      <w:proofErr w:type="gramEnd"/>
       <w:r>
         <w:rPr>
           <w:spacing w:val="-2"/>
@@ -20250,28 +18974,21 @@
         <w:ind w:left="23"/>
       </w:pPr>
       <w:proofErr w:type="spellStart"/>
-      <w:proofErr w:type="gramStart"/>
       <w:r>
         <w:t>plt.scatter</w:t>
       </w:r>
       <w:proofErr w:type="spellEnd"/>
-      <w:proofErr w:type="gramEnd"/>
       <w:r>
         <w:t>(data[</w:t>
       </w:r>
       <w:proofErr w:type="spellStart"/>
       <w:r>
-        <w:t>outlier_</w:t>
-      </w:r>
-      <w:proofErr w:type="gramStart"/>
-      <w:r>
-        <w:t>mask</w:t>
+        <w:t>outlier_mask</w:t>
       </w:r>
       <w:proofErr w:type="spellEnd"/>
       <w:r>
         <w:t>][:,</w:t>
       </w:r>
-      <w:proofErr w:type="gramEnd"/>
       <w:r>
         <w:rPr>
           <w:spacing w:val="-5"/>
@@ -20292,17 +19009,12 @@
       </w:r>
       <w:proofErr w:type="spellStart"/>
       <w:r>
-        <w:t>outlier_</w:t>
-      </w:r>
-      <w:proofErr w:type="gramStart"/>
-      <w:r>
-        <w:t>mask</w:t>
+        <w:t>outlier_mask</w:t>
       </w:r>
       <w:proofErr w:type="spellEnd"/>
       <w:r>
         <w:t>][:,</w:t>
       </w:r>
-      <w:proofErr w:type="gramEnd"/>
       <w:r>
         <w:rPr>
           <w:spacing w:val="-3"/>
@@ -20375,12 +19087,10 @@
         <w:ind w:left="23"/>
       </w:pPr>
       <w:proofErr w:type="spellStart"/>
-      <w:proofErr w:type="gramStart"/>
       <w:r>
         <w:t>plt.plot</w:t>
       </w:r>
       <w:proofErr w:type="spellEnd"/>
-      <w:proofErr w:type="gramEnd"/>
       <w:r>
         <w:t>(x,</w:t>
       </w:r>
@@ -20479,7 +19189,6 @@
         <w:ind w:left="23"/>
       </w:pPr>
       <w:proofErr w:type="spellStart"/>
-      <w:proofErr w:type="gramStart"/>
       <w:r>
         <w:rPr>
           <w:spacing w:val="-2"/>
@@ -20487,7 +19196,6 @@
         <w:t>plt.xlabel</w:t>
       </w:r>
       <w:proofErr w:type="spellEnd"/>
-      <w:proofErr w:type="gramEnd"/>
       <w:r>
         <w:rPr>
           <w:spacing w:val="-2"/>
@@ -20502,7 +19210,6 @@
         <w:ind w:left="23" w:right="7888"/>
       </w:pPr>
       <w:proofErr w:type="spellStart"/>
-      <w:proofErr w:type="gramStart"/>
       <w:r>
         <w:rPr>
           <w:spacing w:val="-2"/>
@@ -20510,7 +19217,6 @@
         <w:t>plt.ylabel</w:t>
       </w:r>
       <w:proofErr w:type="spellEnd"/>
-      <w:proofErr w:type="gramEnd"/>
       <w:r>
         <w:rPr>
           <w:spacing w:val="-2"/>
@@ -20518,7 +19224,6 @@
         <w:t xml:space="preserve">('Y') </w:t>
       </w:r>
       <w:proofErr w:type="spellStart"/>
-      <w:proofErr w:type="gramStart"/>
       <w:r>
         <w:rPr>
           <w:spacing w:val="-2"/>
@@ -20526,7 +19231,6 @@
         <w:t>plt.legend</w:t>
       </w:r>
       <w:proofErr w:type="spellEnd"/>
-      <w:proofErr w:type="gramEnd"/>
       <w:r>
         <w:rPr>
           <w:spacing w:val="-2"/>
@@ -20534,7 +19238,6 @@
         <w:t xml:space="preserve">() </w:t>
       </w:r>
       <w:proofErr w:type="spellStart"/>
-      <w:proofErr w:type="gramStart"/>
       <w:r>
         <w:rPr>
           <w:spacing w:val="-2"/>
@@ -20542,7 +19245,6 @@
         <w:t>plt.grid</w:t>
       </w:r>
       <w:proofErr w:type="spellEnd"/>
-      <w:proofErr w:type="gramEnd"/>
       <w:r>
         <w:rPr>
           <w:spacing w:val="-2"/>
@@ -20550,7 +19252,6 @@
         <w:t xml:space="preserve">(True) </w:t>
       </w:r>
       <w:proofErr w:type="spellStart"/>
-      <w:proofErr w:type="gramStart"/>
       <w:r>
         <w:rPr>
           <w:spacing w:val="-2"/>
@@ -20558,7 +19259,6 @@
         <w:t>plt.show</w:t>
       </w:r>
       <w:proofErr w:type="spellEnd"/>
-      <w:proofErr w:type="gramEnd"/>
       <w:r>
         <w:rPr>
           <w:spacing w:val="-2"/>
@@ -22178,21 +20878,12 @@
         </w:rPr>
         <w:t xml:space="preserve"> </w:t>
       </w:r>
-      <w:proofErr w:type="gramStart"/>
       <w:r>
         <w:rPr>
           <w:b/>
           <w:sz w:val="24"/>
         </w:rPr>
-        <w:t>Let</w:t>
-      </w:r>
-      <w:proofErr w:type="gramEnd"/>
-      <w:r>
-        <w:rPr>
-          <w:b/>
-          <w:sz w:val="24"/>
-        </w:rPr>
-        <w:t xml:space="preserve"> there</w:t>
+        <w:t>Let there</w:t>
       </w:r>
       <w:r>
         <w:rPr>
@@ -23461,12 +22152,10 @@
         <w:t xml:space="preserve"> </w:t>
       </w:r>
       <w:proofErr w:type="spellStart"/>
-      <w:proofErr w:type="gramStart"/>
       <w:r>
         <w:t>np.zeros</w:t>
       </w:r>
       <w:proofErr w:type="spellEnd"/>
-      <w:proofErr w:type="gramEnd"/>
       <w:r>
         <w:t>((256,</w:t>
       </w:r>
@@ -23500,15 +22189,7 @@
       </w:r>
       <w:proofErr w:type="spellEnd"/>
       <w:r>
-        <w:t>=</w:t>
-      </w:r>
-      <w:proofErr w:type="gramStart"/>
-      <w:r>
-        <w:t>np.uint</w:t>
-      </w:r>
-      <w:proofErr w:type="gramEnd"/>
-      <w:r>
-        <w:t xml:space="preserve">8) for </w:t>
+        <w:t xml:space="preserve">=np.uint8) for </w:t>
       </w:r>
       <w:proofErr w:type="spellStart"/>
       <w:r>
@@ -23516,15 +22197,7 @@
       </w:r>
       <w:proofErr w:type="spellEnd"/>
       <w:r>
-        <w:t xml:space="preserve"> in </w:t>
-      </w:r>
-      <w:proofErr w:type="gramStart"/>
-      <w:r>
-        <w:t>range(</w:t>
-      </w:r>
-      <w:proofErr w:type="gramEnd"/>
-      <w:r>
-        <w:t>256):</w:t>
+        <w:t xml:space="preserve"> in range(256):</w:t>
       </w:r>
     </w:p>
     <w:p>
@@ -23535,18 +22208,13 @@
       </w:pPr>
       <w:proofErr w:type="spellStart"/>
       <w:r>
-        <w:t>color_lookup_</w:t>
-      </w:r>
-      <w:proofErr w:type="gramStart"/>
-      <w:r>
-        <w:t>table</w:t>
+        <w:t>color_lookup_table</w:t>
       </w:r>
       <w:proofErr w:type="spellEnd"/>
       <w:r>
         <w:t>[</w:t>
       </w:r>
       <w:proofErr w:type="spellStart"/>
-      <w:proofErr w:type="gramEnd"/>
       <w:r>
         <w:t>i</w:t>
       </w:r>
@@ -23570,18 +22238,13 @@
       </w:r>
       <w:proofErr w:type="spellStart"/>
       <w:r>
-        <w:t>color_lookup_</w:t>
-      </w:r>
-      <w:proofErr w:type="gramStart"/>
-      <w:r>
-        <w:t>table</w:t>
+        <w:t>color_lookup_table</w:t>
       </w:r>
       <w:proofErr w:type="spellEnd"/>
       <w:r>
         <w:t>[</w:t>
       </w:r>
       <w:proofErr w:type="spellStart"/>
-      <w:proofErr w:type="gramEnd"/>
       <w:r>
         <w:t>i</w:t>
       </w:r>
@@ -23600,18 +22263,13 @@
       </w:r>
       <w:proofErr w:type="spellStart"/>
       <w:r>
-        <w:t>color_lookup_</w:t>
-      </w:r>
-      <w:proofErr w:type="gramStart"/>
-      <w:r>
-        <w:t>table</w:t>
+        <w:t>color_lookup_table</w:t>
       </w:r>
       <w:proofErr w:type="spellEnd"/>
       <w:r>
         <w:t>[</w:t>
       </w:r>
       <w:proofErr w:type="spellStart"/>
-      <w:proofErr w:type="gramEnd"/>
       <w:r>
         <w:t>i</w:t>
       </w:r>
@@ -23732,12 +22390,10 @@
         </w:rPr>
         <w:t xml:space="preserve"> </w:t>
       </w:r>
-      <w:proofErr w:type="gramStart"/>
       <w:r>
         <w:t>cv2.LUT(</w:t>
       </w:r>
       <w:proofErr w:type="spellStart"/>
-      <w:proofErr w:type="gramEnd"/>
       <w:r>
         <w:t>color_image</w:t>
       </w:r>
@@ -24712,19 +23368,11 @@
       </w:r>
       <w:proofErr w:type="spellStart"/>
       <w:r>
-        <w:t>estimate_</w:t>
-      </w:r>
-      <w:proofErr w:type="gramStart"/>
-      <w:r>
-        <w:t>alpha</w:t>
-      </w:r>
-      <w:proofErr w:type="spellEnd"/>
-      <w:r>
-        <w:t>(</w:t>
-      </w:r>
-      <w:proofErr w:type="gramEnd"/>
-      <w:r>
-        <w:t>image,</w:t>
+        <w:t>estimate_alpha</w:t>
+      </w:r>
+      <w:proofErr w:type="spellEnd"/>
+      <w:r>
+        <w:t>(image,</w:t>
       </w:r>
       <w:r>
         <w:rPr>
@@ -24766,22 +23414,12 @@
         <w:t xml:space="preserve"> </w:t>
       </w:r>
       <w:proofErr w:type="spellStart"/>
-      <w:proofErr w:type="gramStart"/>
       <w:r>
         <w:t>image.astype</w:t>
       </w:r>
       <w:proofErr w:type="spellEnd"/>
-      <w:proofErr w:type="gramEnd"/>
-      <w:r>
-        <w:t>(</w:t>
-      </w:r>
-      <w:proofErr w:type="gramStart"/>
-      <w:r>
-        <w:t>np.float</w:t>
-      </w:r>
-      <w:proofErr w:type="gramEnd"/>
-      <w:r>
-        <w:t>32)</w:t>
+      <w:r>
+        <w:t>(np.float32)</w:t>
       </w:r>
       <w:r>
         <w:rPr>
@@ -24885,22 +23523,12 @@
         <w:t xml:space="preserve"> </w:t>
       </w:r>
       <w:proofErr w:type="spellStart"/>
-      <w:proofErr w:type="gramStart"/>
       <w:r>
         <w:t>trimap.astype</w:t>
       </w:r>
       <w:proofErr w:type="spellEnd"/>
-      <w:proofErr w:type="gramEnd"/>
-      <w:r>
-        <w:t>(</w:t>
-      </w:r>
-      <w:proofErr w:type="gramStart"/>
-      <w:r>
-        <w:t>np.float</w:t>
-      </w:r>
-      <w:proofErr w:type="gramEnd"/>
-      <w:r>
-        <w:t>32)</w:t>
+      <w:r>
+        <w:t>(np.float32)</w:t>
       </w:r>
       <w:r>
         <w:rPr>
@@ -25005,12 +23633,10 @@
         <w:t xml:space="preserve"> </w:t>
       </w:r>
       <w:proofErr w:type="spellStart"/>
-      <w:proofErr w:type="gramStart"/>
       <w:r>
         <w:t>np.where</w:t>
       </w:r>
       <w:proofErr w:type="spellEnd"/>
-      <w:proofErr w:type="gramEnd"/>
       <w:r>
         <w:t>(</w:t>
       </w:r>
@@ -25083,12 +23709,10 @@
         <w:t xml:space="preserve">mask alpha = </w:t>
       </w:r>
       <w:proofErr w:type="spellStart"/>
-      <w:proofErr w:type="gramStart"/>
       <w:r>
         <w:t>np.where</w:t>
       </w:r>
       <w:proofErr w:type="spellEnd"/>
-      <w:proofErr w:type="gramEnd"/>
       <w:r>
         <w:t>(</w:t>
       </w:r>
@@ -25143,13 +23767,8 @@
         </w:rPr>
         <w:t xml:space="preserve"> </w:t>
       </w:r>
-      <w:proofErr w:type="gramStart"/>
-      <w:r>
-        <w:t>range(</w:t>
-      </w:r>
-      <w:proofErr w:type="gramEnd"/>
-      <w:r>
-        <w:t>5):</w:t>
+      <w:r>
+        <w:t>range(5):</w:t>
       </w:r>
       <w:r>
         <w:rPr>
@@ -25201,13 +23820,8 @@
         <w:t xml:space="preserve"> </w:t>
       </w:r>
       <w:r>
-        <w:t>(image</w:t>
-      </w:r>
-      <w:proofErr w:type="gramStart"/>
-      <w:r>
-        <w:t>[:,</w:t>
-      </w:r>
-      <w:proofErr w:type="gramEnd"/>
+        <w:t>(image[:,</w:t>
+      </w:r>
       <w:r>
         <w:rPr>
           <w:spacing w:val="-2"/>
@@ -25233,13 +23847,8 @@
         <w:t xml:space="preserve"> </w:t>
       </w:r>
       <w:r>
-        <w:t>image</w:t>
-      </w:r>
-      <w:proofErr w:type="gramStart"/>
-      <w:r>
-        <w:t>[:,</w:t>
-      </w:r>
-      <w:proofErr w:type="gramEnd"/>
+        <w:t>image[:,</w:t>
+      </w:r>
       <w:r>
         <w:rPr>
           <w:spacing w:val="-2"/>
@@ -25385,12 +23994,10 @@
         <w:t xml:space="preserve"> </w:t>
       </w:r>
       <w:proofErr w:type="spellStart"/>
-      <w:proofErr w:type="gramStart"/>
       <w:r>
         <w:t>np.clip</w:t>
       </w:r>
       <w:proofErr w:type="spellEnd"/>
-      <w:proofErr w:type="gramEnd"/>
       <w:r>
         <w:t>(alpha,</w:t>
       </w:r>
@@ -25487,7 +24094,6 @@
         <w:spacing w:before="183" w:line="396" w:lineRule="auto"/>
         <w:ind w:left="263" w:right="6795" w:hanging="240"/>
       </w:pPr>
-      <w:proofErr w:type="gramStart"/>
       <w:r>
         <w:t xml:space="preserve">if </w:t>
       </w:r>
@@ -25502,7 +24108,6 @@
       <w:r>
         <w:t>name</w:t>
       </w:r>
-      <w:proofErr w:type="gramEnd"/>
       <w:r>
         <w:rPr>
           <w:u w:val="single"/>
@@ -25743,19 +24348,11 @@
       </w:r>
       <w:proofErr w:type="spellStart"/>
       <w:r>
-        <w:t>estimate_</w:t>
-      </w:r>
-      <w:proofErr w:type="gramStart"/>
-      <w:r>
-        <w:t>alpha</w:t>
-      </w:r>
-      <w:proofErr w:type="spellEnd"/>
-      <w:r>
-        <w:t>(</w:t>
-      </w:r>
-      <w:proofErr w:type="gramEnd"/>
-      <w:r>
-        <w:t>image,</w:t>
+        <w:t>estimate_alpha</w:t>
+      </w:r>
+      <w:proofErr w:type="spellEnd"/>
+      <w:r>
+        <w:t>(image,</w:t>
       </w:r>
       <w:r>
         <w:rPr>
@@ -25871,10 +24468,10 @@
           <w:sz w:val="20"/>
         </w:rPr>
         <w:drawing>
-          <wp:inline distT="0" distB="0" distL="0" distR="0" wp14:anchorId="4A1C16AC" wp14:editId="0B1E1CF7">
-            <wp:extent cx="4178515" cy="1416123"/>
+          <wp:inline distT="0" distB="0" distL="0" distR="0" wp14:anchorId="3CE5078E" wp14:editId="26E51D95">
+            <wp:extent cx="4286470" cy="1930499"/>
             <wp:effectExtent l="0" t="0" r="0" b="0"/>
-            <wp:docPr id="2019806192" name="Picture 35"/>
+            <wp:docPr id="37344137" name="Picture 28"/>
             <wp:cNvGraphicFramePr>
               <a:graphicFrameLocks xmlns:a="http://schemas.openxmlformats.org/drawingml/2006/main" noChangeAspect="1"/>
             </wp:cNvGraphicFramePr>
@@ -25882,7 +24479,7 @@
               <a:graphicData uri="http://schemas.openxmlformats.org/drawingml/2006/picture">
                 <pic:pic xmlns:pic="http://schemas.openxmlformats.org/drawingml/2006/picture">
                   <pic:nvPicPr>
-                    <pic:cNvPr id="2019806192" name="Picture 2019806192"/>
+                    <pic:cNvPr id="37344137" name="Picture 37344137"/>
                     <pic:cNvPicPr/>
                   </pic:nvPicPr>
                   <pic:blipFill>
@@ -25900,7 +24497,7 @@
                   <pic:spPr>
                     <a:xfrm>
                       <a:off x="0" y="0"/>
-                      <a:ext cx="4178515" cy="1416123"/>
+                      <a:ext cx="4286470" cy="1930499"/>
                     </a:xfrm>
                     <a:prstGeom prst="rect">
                       <a:avLst/>
@@ -28276,6 +26873,7 @@
   <w:style w:type="character" w:default="1" w:styleId="DefaultParagraphFont">
     <w:name w:val="Default Paragraph Font"/>
     <w:uiPriority w:val="1"/>
+    <w:semiHidden/>
     <w:unhideWhenUsed/>
   </w:style>
   <w:style w:type="table" w:default="1" w:styleId="TableNormal">

</xml_diff>

<commit_message>
added ahmed cv word
</commit_message>
<xml_diff>
--- a/SEM2/Computer Vision/Practical/Journal/computer vision practical journal v1.docx
+++ b/SEM2/Computer Vision/Practical/Journal/computer vision practical journal v1.docx
@@ -2,46 +2,6 @@
 <file path=word/document.xml><?xml version="1.0" encoding="utf-8"?>
 <w:document xmlns:wpc="http://schemas.microsoft.com/office/word/2010/wordprocessingCanvas" xmlns:cx="http://schemas.microsoft.com/office/drawing/2014/chartex" xmlns:cx1="http://schemas.microsoft.com/office/drawing/2015/9/8/chartex" xmlns:cx2="http://schemas.microsoft.com/office/drawing/2015/10/21/chartex" xmlns:cx3="http://schemas.microsoft.com/office/drawing/2016/5/9/chartex" xmlns:cx4="http://schemas.microsoft.com/office/drawing/2016/5/10/chartex" xmlns:cx5="http://schemas.microsoft.com/office/drawing/2016/5/11/chartex" xmlns:cx6="http://schemas.microsoft.com/office/drawing/2016/5/12/chartex" xmlns:cx7="http://schemas.microsoft.com/office/drawing/2016/5/13/chartex" xmlns:cx8="http://schemas.microsoft.com/office/drawing/2016/5/14/chartex" xmlns:mc="http://schemas.openxmlformats.org/markup-compatibility/2006" xmlns:aink="http://schemas.microsoft.com/office/drawing/2016/ink" xmlns:am3d="http://schemas.microsoft.com/office/drawing/2017/model3d" xmlns:o="urn:schemas-microsoft-com:office:office" xmlns:oel="http://schemas.microsoft.com/office/2019/extlst" xmlns:r="http://schemas.openxmlformats.org/officeDocument/2006/relationships" xmlns:m="http://schemas.openxmlformats.org/officeDocument/2006/math" xmlns:v="urn:schemas-microsoft-com:vml" xmlns:wp14="http://schemas.microsoft.com/office/word/2010/wordprocessingDrawing" xmlns:wp="http://schemas.openxmlformats.org/drawingml/2006/wordprocessingDrawing" xmlns:w10="urn:schemas-microsoft-com:office:word" xmlns:w="http://schemas.openxmlformats.org/wordprocessingml/2006/main" xmlns:w14="http://schemas.microsoft.com/office/word/2010/wordml" xmlns:w15="http://schemas.microsoft.com/office/word/2012/wordml" xmlns:w16cex="http://schemas.microsoft.com/office/word/2018/wordml/cex" xmlns:w16cid="http://schemas.microsoft.com/office/word/2016/wordml/cid" xmlns:w16="http://schemas.microsoft.com/office/word/2018/wordml" xmlns:w16du="http://schemas.microsoft.com/office/word/2023/wordml/word16du" xmlns:w16sdtdh="http://schemas.microsoft.com/office/word/2020/wordml/sdtdatahash" xmlns:w16sdtfl="http://schemas.microsoft.com/office/word/2024/wordml/sdtformatlock" xmlns:w16se="http://schemas.microsoft.com/office/word/2015/wordml/symex" xmlns:wpg="http://schemas.microsoft.com/office/word/2010/wordprocessingGroup" xmlns:wpi="http://schemas.microsoft.com/office/word/2010/wordprocessingInk" xmlns:wne="http://schemas.microsoft.com/office/word/2006/wordml" xmlns:wps="http://schemas.microsoft.com/office/word/2010/wordprocessingShape" mc:Ignorable="w14 w15 w16se w16cid w16 w16cex w16sdtdh w16sdtfl w16du wp14">
   <w:body>
-    <w:p>
-      <w:r>
-        <w:br w:type="page"/>
-      </w:r>
-    </w:p>
-    <w:p>
-      <w:r>
-        <w:lastRenderedPageBreak/>
-        <w:br w:type="page"/>
-      </w:r>
-    </w:p>
-    <w:p>
-      <w:pPr>
-        <w:rPr>
-          <w:b/>
-          <w:bCs/>
-          <w:sz w:val="40"/>
-          <w:szCs w:val="40"/>
-        </w:rPr>
-      </w:pPr>
-    </w:p>
-    <w:p>
-      <w:pPr>
-        <w:rPr>
-          <w:b/>
-          <w:bCs/>
-          <w:sz w:val="40"/>
-          <w:szCs w:val="40"/>
-        </w:rPr>
-      </w:pPr>
-      <w:r>
-        <w:rPr>
-          <w:b/>
-          <w:bCs/>
-          <w:sz w:val="40"/>
-          <w:szCs w:val="40"/>
-        </w:rPr>
-        <w:br w:type="page"/>
-      </w:r>
-    </w:p>
     <w:p>
       <w:pPr>
         <w:rPr>
@@ -11538,7 +11498,7 @@
           <w:noProof/>
         </w:rPr>
         <w:drawing>
-          <wp:inline distT="0" distB="0" distL="0" distR="0" wp14:anchorId="23045A70" wp14:editId="3FC04594">
+          <wp:inline distT="0" distB="0" distL="0" distR="0" wp14:anchorId="23045A70" wp14:editId="09881D57">
             <wp:extent cx="5854662" cy="2546350"/>
             <wp:effectExtent l="0" t="0" r="0" b="6350"/>
             <wp:docPr id="485288603" name="Picture 29"/>

</xml_diff>